<commit_message>
Refresh beginner Chinese DOCX for stable usable Phase 1-3 build.
Document current install/use flow: AutoPlayer, preview, autofind Skill,
pixel dry-run, guarded keypress, and packaging notes.
</commit_message>
<xml_diff>
--- a/docs/CleanClient-小白完整使用手册.docx
+++ b/docs/CleanClient-小白完整使用手册.docx
@@ -28,7 +28,7 @@
           <w:color w:val="555555"/>
           <w:sz w:val="24"/>
         </w:rPr>
-        <w:t>魔兽世界自动循环客户端（研究 / 开发版）</w:t>
+        <w:t>稳定可用版（阶段 1–3 已完成）· 研究 / 开发向发版</w:t>
       </w:r>
     </w:p>
     <w:p>
@@ -43,7 +43,7 @@
           <w:color w:val="777777"/>
           <w:sz w:val="21"/>
         </w:rPr>
-        <w:t>面向完全没有技术背景的使用者 · 按步骤照做即可</w:t>
+        <w:t>面向零基础用户 · 按步骤照做即可</w:t>
       </w:r>
     </w:p>
     <w:p>
@@ -58,7 +58,7 @@
           <w:color w:val="888888"/>
           <w:sz w:val="20"/>
         </w:rPr>
-        <w:t>文档位置：docs\CleanClient-小白完整使用手册.docx</w:t>
+        <w:t>文档：docs\CleanClient-小白完整使用手册.docx</w:t>
       </w:r>
     </w:p>
     <w:p>
@@ -71,7 +71,7 @@
           <w:b/>
           <w:sz w:val="22"/>
         </w:rPr>
-        <w:t>先看这三句（非常重要）</w:t>
+        <w:t>先看这四句（非常重要）</w:t>
       </w:r>
     </w:p>
     <w:p>
@@ -85,7 +85,7 @@
           <w:b w:val="0"/>
           <w:sz w:val="22"/>
         </w:rPr>
-        <w:t>这个软件现在是「研究 / 开发版」，默认只记日志，不会替你按键打怪。</w:t>
+        <w:t>这是当前「稳定可用版」，不是永不改动的最终商业正式版；后续还可增强。</w:t>
       </w:r>
     </w:p>
     <w:p>
@@ -99,7 +99,7 @@
           <w:b w:val="0"/>
           <w:sz w:val="22"/>
         </w:rPr>
-        <w:t>发版包里有两样东西：电脑软件 CleanClient.exe，以及魔兽插件 addon\AutoPlayer。插件不会自动装进游戏，必须你自己复制。</w:t>
+        <w:t>默认「只记日志，不按键」。取消勾选时会弹确认框，确认后才会真按键。</w:t>
       </w:r>
     </w:p>
     <w:p>
@@ -113,7 +113,21 @@
           <w:b w:val="0"/>
           <w:sz w:val="22"/>
         </w:rPr>
-        <w:t>如果日志里一直显示「空闲」，在默认「模拟识别」模式下是正常现象，不代表软件坏了。</w:t>
+        <w:t>发版包里有两样东西：CleanClient.exe（电脑软件）和 addon\AutoPlayer（魔兽插件）。插件必须手动复制进游戏。</w:t>
+      </w:r>
+    </w:p>
+    <w:p>
+      <w:pPr>
+        <w:pStyle w:val="ListBullet"/>
+        <w:spacing w:after="40"/>
+      </w:pPr>
+      <w:r>
+        <w:rPr>
+          <w:rFonts w:ascii="微软雅黑" w:hAnsi="微软雅黑" w:eastAsia="微软雅黑"/>
+          <w:b w:val="0"/>
+          <w:sz w:val="22"/>
+        </w:rPr>
+        <w:t>第一次请先干跑看日志出现「动作 法术ID=…」，确认无误后再考虑真按键。</w:t>
       </w:r>
     </w:p>
     <w:p>
@@ -140,7 +154,7 @@
           <w:b w:val="0"/>
           <w:sz w:val="22"/>
         </w:rPr>
-        <w:t>一台已经能正常登录《魔兽世界》正式服 / 时光服的电脑。</w:t>
+        <w:t>能正常登录《魔兽世界》正式服 / 时光服的电脑。</w:t>
       </w:r>
     </w:p>
     <w:p>
@@ -154,7 +168,7 @@
           <w:b w:val="0"/>
           <w:sz w:val="22"/>
         </w:rPr>
-        <w:t>一份完整的 CleanClient 发版文件夹（不要只有单独一个 exe）。</w:t>
+        <w:t>完整的 CleanClient 发版文件夹（不要只有单独一个 exe）。</w:t>
       </w:r>
     </w:p>
     <w:p>
@@ -168,7 +182,7 @@
           <w:b w:val="0"/>
           <w:sz w:val="22"/>
         </w:rPr>
-        <w:t>知道自己魔兽安装在哪个盘（后面要复制插件）。</w:t>
+        <w:t>知道魔兽安装目录（要复制插件）。</w:t>
       </w:r>
     </w:p>
     <w:p>
@@ -208,7 +222,7 @@
           <w:b w:val="0"/>
           <w:sz w:val="22"/>
         </w:rPr>
-        <w:t>打开后，正常应看到这些内容：</w:t>
+        <w:t>正常应看到：</w:t>
       </w:r>
     </w:p>
     <w:tbl>
@@ -301,7 +315,7 @@
                 <w:b w:val="0"/>
                 <w:sz w:val="21"/>
               </w:rPr>
-              <w:t>电脑上的控制软件</w:t>
+              <w:t>控制软件</w:t>
             </w:r>
           </w:p>
         </w:tc>
@@ -351,7 +365,7 @@
                 <w:b w:val="0"/>
                 <w:sz w:val="21"/>
               </w:rPr>
-              <w:t>软件运行依赖</w:t>
+              <w:t>运行依赖</w:t>
             </w:r>
           </w:p>
         </w:tc>
@@ -367,7 +381,7 @@
                 <w:b w:val="0"/>
                 <w:sz w:val="21"/>
               </w:rPr>
-              <w:t>不要删、不要单独挪走</w:t>
+              <w:t>不要删、不要只拷 exe</w:t>
             </w:r>
           </w:p>
         </w:tc>
@@ -401,7 +415,7 @@
                 <w:b w:val="0"/>
                 <w:sz w:val="21"/>
               </w:rPr>
-              <w:t>魔兽世界插件</w:t>
+              <w:t>魔兽插件</w:t>
             </w:r>
           </w:p>
         </w:tc>
@@ -417,7 +431,7 @@
                 <w:b w:val="0"/>
                 <w:sz w:val="21"/>
               </w:rPr>
-              <w:t>复制到魔兽 AddOns 目录</w:t>
+              <w:t>复制到 AddOns</w:t>
             </w:r>
           </w:p>
         </w:tc>
@@ -467,7 +481,7 @@
                 <w:b w:val="0"/>
                 <w:sz w:val="21"/>
               </w:rPr>
-              <w:t>不会用时打开查看</w:t>
+              <w:t>不会用时查看</w:t>
             </w:r>
           </w:p>
         </w:tc>
@@ -501,7 +515,7 @@
                 <w:b w:val="0"/>
                 <w:sz w:val="21"/>
               </w:rPr>
-              <w:t>最短安装提醒</w:t>
+              <w:t>最短提醒</w:t>
             </w:r>
           </w:p>
         </w:tc>
@@ -517,7 +531,7 @@
                 <w:b w:val="0"/>
                 <w:sz w:val="21"/>
               </w:rPr>
-              <w:t>建议先看一遍</w:t>
+              <w:t>建议先看</w:t>
             </w:r>
           </w:p>
         </w:tc>
@@ -534,12 +548,13 @@
           <w:b/>
           <w:sz w:val="32"/>
         </w:rPr>
-        <w:t>二、第一步：把插件装进魔兽世界</w:t>
+        <w:t>二、安装魔兽插件 AutoPlayer</w:t>
       </w:r>
     </w:p>
     <w:p>
       <w:pPr>
-        <w:spacing w:after="120" w:line="360" w:lineRule="auto"/>
+        <w:pStyle w:val="ListNumber"/>
+        <w:spacing w:after="40"/>
       </w:pPr>
       <w:r>
         <w:rPr>
@@ -547,20 +562,21 @@
           <w:b w:val="0"/>
           <w:sz w:val="22"/>
         </w:rPr>
-        <w:t>软件本身不会自动把插件装进游戏。你必须先完成这一步，以后要做真实识别才有基础。</w:t>
+        <w:t>完全退出魔兽世界。</w:t>
       </w:r>
     </w:p>
     <w:p>
       <w:pPr>
-        <w:spacing w:after="120" w:line="360" w:lineRule="auto"/>
+        <w:pStyle w:val="ListNumber"/>
+        <w:spacing w:after="40"/>
       </w:pPr>
       <w:r>
         <w:rPr>
           <w:rFonts w:ascii="微软雅黑" w:hAnsi="微软雅黑" w:eastAsia="微软雅黑"/>
-          <w:b/>
+          <w:b w:val="0"/>
           <w:sz w:val="22"/>
         </w:rPr>
-        <w:t>1）找到发版包里的插件文件夹</w:t>
+        <w:t>复制发版包里的 addon\AutoPlayer 到：</w:t>
       </w:r>
     </w:p>
     <w:p>
@@ -574,7 +590,7 @@
           <w:b w:val="0"/>
           <w:sz w:val="21"/>
         </w:rPr>
-        <w:t>...\CleanClient\addon\AutoPlayer</w:t>
+        <w:t>...\World of Warcraft\_retail_\Interface\AddOns\AutoPlayer</w:t>
       </w:r>
     </w:p>
     <w:p>
@@ -587,33 +603,7 @@
           <w:b w:val="0"/>
           <w:sz w:val="22"/>
         </w:rPr>
-        <w:t>确认这个文件夹里能看到 AutoPlayer.toc、AutoPlayer.lua 等文件。</w:t>
-      </w:r>
-    </w:p>
-    <w:p>
-      <w:pPr>
-        <w:spacing w:after="120" w:line="360" w:lineRule="auto"/>
-      </w:pPr>
-      <w:r>
-        <w:rPr>
-          <w:rFonts w:ascii="微软雅黑" w:hAnsi="微软雅黑" w:eastAsia="微软雅黑"/>
-          <w:b/>
-          <w:sz w:val="22"/>
-        </w:rPr>
-        <w:t>2）找到魔兽正式服插件目录</w:t>
-      </w:r>
-    </w:p>
-    <w:p>
-      <w:pPr>
-        <w:spacing w:after="120" w:line="360" w:lineRule="auto"/>
-      </w:pPr>
-      <w:r>
-        <w:rPr>
-          <w:rFonts w:ascii="微软雅黑" w:hAnsi="微软雅黑" w:eastAsia="微软雅黑"/>
-          <w:b w:val="0"/>
-          <w:sz w:val="22"/>
-        </w:rPr>
-        <w:t>正式服 / 时光服一般是：</w:t>
+        <w:t>正确结果必须能看到：</w:t>
       </w:r>
     </w:p>
     <w:p>
@@ -627,7 +617,7 @@
           <w:b w:val="0"/>
           <w:sz w:val="21"/>
         </w:rPr>
-        <w:t>...\World of Warcraft\_retail_\Interface\AddOns</w:t>
+        <w:t>...\AddOns\AutoPlayer\AutoPlayer.toc</w:t>
       </w:r>
     </w:p>
     <w:p>
@@ -640,131 +630,7 @@
           <w:b w:val="0"/>
           <w:sz w:val="22"/>
         </w:rPr>
-        <w:t>如果你不知道魔兽装在哪：</w:t>
-      </w:r>
-    </w:p>
-    <w:p>
-      <w:pPr>
-        <w:pStyle w:val="ListBullet"/>
-        <w:spacing w:after="40"/>
-      </w:pPr>
-      <w:r>
-        <w:rPr>
-          <w:rFonts w:ascii="微软雅黑" w:hAnsi="微软雅黑" w:eastAsia="微软雅黑"/>
-          <w:b w:val="0"/>
-          <w:sz w:val="22"/>
-        </w:rPr>
-        <w:t>打开战网 → 魔兽世界 → 设置（齿轮）→ 查看安装文件夹。</w:t>
-      </w:r>
-    </w:p>
-    <w:p>
-      <w:pPr>
-        <w:pStyle w:val="ListBullet"/>
-        <w:spacing w:after="40"/>
-      </w:pPr>
-      <w:r>
-        <w:rPr>
-          <w:rFonts w:ascii="微软雅黑" w:hAnsi="微软雅黑" w:eastAsia="微软雅黑"/>
-          <w:b w:val="0"/>
-          <w:sz w:val="22"/>
-        </w:rPr>
-        <w:t>然后进入：_retail_ → Interface → AddOns。</w:t>
-      </w:r>
-    </w:p>
-    <w:p>
-      <w:pPr>
-        <w:pStyle w:val="ListBullet"/>
-        <w:spacing w:after="40"/>
-      </w:pPr>
-      <w:r>
-        <w:rPr>
-          <w:rFonts w:ascii="微软雅黑" w:hAnsi="微软雅黑" w:eastAsia="微软雅黑"/>
-          <w:b w:val="0"/>
-          <w:sz w:val="22"/>
-        </w:rPr>
-        <w:t>如果没有 Interface 或 AddOns 文件夹，可以自己新建同名文件夹。</w:t>
-      </w:r>
-    </w:p>
-    <w:p>
-      <w:pPr>
-        <w:spacing w:after="120" w:line="360" w:lineRule="auto"/>
-      </w:pPr>
-      <w:r>
-        <w:rPr>
-          <w:rFonts w:ascii="微软雅黑" w:hAnsi="微软雅黑" w:eastAsia="微软雅黑"/>
-          <w:b/>
-          <w:sz w:val="22"/>
-        </w:rPr>
-        <w:t>3）复制插件</w:t>
-      </w:r>
-    </w:p>
-    <w:p>
-      <w:pPr>
-        <w:pStyle w:val="ListNumber"/>
-        <w:spacing w:after="40"/>
-      </w:pPr>
-      <w:r>
-        <w:rPr>
-          <w:rFonts w:ascii="微软雅黑" w:hAnsi="微软雅黑" w:eastAsia="微软雅黑"/>
-          <w:b w:val="0"/>
-          <w:sz w:val="22"/>
-        </w:rPr>
-        <w:t>先完全退出魔兽世界（不要只退到选人界面）。</w:t>
-      </w:r>
-    </w:p>
-    <w:p>
-      <w:pPr>
-        <w:pStyle w:val="ListNumber"/>
-        <w:spacing w:after="40"/>
-      </w:pPr>
-      <w:r>
-        <w:rPr>
-          <w:rFonts w:ascii="微软雅黑" w:hAnsi="微软雅黑" w:eastAsia="微软雅黑"/>
-          <w:b w:val="0"/>
-          <w:sz w:val="22"/>
-        </w:rPr>
-        <w:t>把 AutoPlayer 整个文件夹复制到 AddOns 目录下。</w:t>
-      </w:r>
-    </w:p>
-    <w:p>
-      <w:pPr>
-        <w:pStyle w:val="ListNumber"/>
-        <w:spacing w:after="40"/>
-      </w:pPr>
-      <w:r>
-        <w:rPr>
-          <w:rFonts w:ascii="微软雅黑" w:hAnsi="微软雅黑" w:eastAsia="微软雅黑"/>
-          <w:b w:val="0"/>
-          <w:sz w:val="22"/>
-        </w:rPr>
-        <w:t>复制完成后路径应类似下面这样。</w:t>
-      </w:r>
-    </w:p>
-    <w:p>
-      <w:pPr>
-        <w:spacing w:after="120"/>
-        <w:ind w:left="283"/>
-      </w:pPr>
-      <w:r>
-        <w:rPr>
-          <w:rFonts w:ascii="Consolas" w:hAnsi="Consolas" w:eastAsia="微软雅黑"/>
-          <w:b w:val="0"/>
-          <w:sz w:val="21"/>
-        </w:rPr>
-        <w:t>...\World of Warcraft\_retail_\Interface\AddOns\AutoPlayer\AutoPlayer.toc</w:t>
-      </w:r>
-    </w:p>
-    <w:p>
-      <w:pPr>
-        <w:spacing w:after="120" w:line="360" w:lineRule="auto"/>
-      </w:pPr>
-      <w:r>
-        <w:rPr>
-          <w:rFonts w:ascii="微软雅黑" w:hAnsi="微软雅黑" w:eastAsia="微软雅黑"/>
-          <w:b w:val="0"/>
-          <w:sz w:val="22"/>
-        </w:rPr>
-        <w:t>常见错误：多套了一层文件夹。下面这种是错的：</w:t>
+        <w:t>错误示例（多套一层）：</w:t>
       </w:r>
     </w:p>
     <w:p>
@@ -783,15 +649,16 @@
     </w:p>
     <w:p>
       <w:pPr>
-        <w:spacing w:after="120" w:line="360" w:lineRule="auto"/>
+        <w:pStyle w:val="ListNumber"/>
+        <w:spacing w:after="40"/>
       </w:pPr>
       <w:r>
         <w:rPr>
           <w:rFonts w:ascii="微软雅黑" w:hAnsi="微软雅黑" w:eastAsia="微软雅黑"/>
-          <w:b/>
+          <w:b w:val="0"/>
           <w:sz w:val="22"/>
         </w:rPr>
-        <w:t>4）在游戏里启用插件</w:t>
+        <w:t>重新打开魔兽，选人界面点「插件」，勾选 AutoPlayer。</w:t>
       </w:r>
     </w:p>
     <w:p>
@@ -805,49 +672,7 @@
           <w:b w:val="0"/>
           <w:sz w:val="22"/>
         </w:rPr>
-        <w:t>重新打开魔兽世界。</w:t>
-      </w:r>
-    </w:p>
-    <w:p>
-      <w:pPr>
-        <w:pStyle w:val="ListNumber"/>
-        <w:spacing w:after="40"/>
-      </w:pPr>
-      <w:r>
-        <w:rPr>
-          <w:rFonts w:ascii="微软雅黑" w:hAnsi="微软雅黑" w:eastAsia="微软雅黑"/>
-          <w:b w:val="0"/>
-          <w:sz w:val="22"/>
-        </w:rPr>
-        <w:t>在选角色界面点击「插件」。</w:t>
-      </w:r>
-    </w:p>
-    <w:p>
-      <w:pPr>
-        <w:pStyle w:val="ListNumber"/>
-        <w:spacing w:after="40"/>
-      </w:pPr>
-      <w:r>
-        <w:rPr>
-          <w:rFonts w:ascii="微软雅黑" w:hAnsi="微软雅黑" w:eastAsia="微软雅黑"/>
-          <w:b w:val="0"/>
-          <w:sz w:val="22"/>
-        </w:rPr>
-        <w:t>勾选 AutoPlayer。</w:t>
-      </w:r>
-    </w:p>
-    <w:p>
-      <w:pPr>
-        <w:pStyle w:val="ListNumber"/>
-        <w:spacing w:after="40"/>
-      </w:pPr>
-      <w:r>
-        <w:rPr>
-          <w:rFonts w:ascii="微软雅黑" w:hAnsi="微软雅黑" w:eastAsia="微软雅黑"/>
-          <w:b w:val="0"/>
-          <w:sz w:val="22"/>
-        </w:rPr>
-        <w:t>进入游戏。若插件正常，通常会出现协议相关的色块 / 像素条（具体外观以插件为准）。</w:t>
+        <w:t>进游戏后应能看到协议相关色块/像素条（外观以插件为准）。</w:t>
       </w:r>
     </w:p>
     <w:p>
@@ -860,7 +685,7 @@
           <w:b/>
           <w:sz w:val="32"/>
         </w:rPr>
-        <w:t>三、第二步：打开 CleanClient 软件</w:t>
+        <w:t>三、打开软件</w:t>
       </w:r>
     </w:p>
     <w:p>
@@ -873,7 +698,7 @@
           <w:b/>
           <w:sz w:val="22"/>
         </w:rPr>
-        <w:t>方式一：双击 exe（推荐小白使用）</w:t>
+        <w:t>方式 A：双击 exe（推荐）</w:t>
       </w:r>
     </w:p>
     <w:p>
@@ -901,7 +726,7 @@
           <w:b w:val="0"/>
           <w:sz w:val="22"/>
         </w:rPr>
-        <w:t>必须保持整个 CleanClient 文件夹完整。</w:t>
+        <w:t>保持整个 CleanClient 文件夹完整。</w:t>
       </w:r>
     </w:p>
     <w:p>
@@ -915,7 +740,7 @@
           <w:b w:val="0"/>
           <w:sz w:val="22"/>
         </w:rPr>
-        <w:t>不要只把 CleanClient.exe 单独拷到桌面再打开，容易打不开或报错。</w:t>
+        <w:t>若杀毒误报，确认来源是你自己打包的结果后再放行。</w:t>
       </w:r>
     </w:p>
     <w:p>
@@ -929,7 +754,7 @@
           <w:b w:val="0"/>
           <w:sz w:val="22"/>
         </w:rPr>
-        <w:t>如果 Windows 提示未知发布者 / 杀毒拦截，可先允许本次运行（本软件是本地打包的 Python 程序）。</w:t>
+        <w:t>源码有更新后，请重新运行 scripts\pack-CleanClient.bat 再发版。</w:t>
       </w:r>
     </w:p>
     <w:p>
@@ -942,7 +767,7 @@
           <w:b/>
           <w:sz w:val="22"/>
         </w:rPr>
-        <w:t>方式二：用源码启动（给会敲命令的人）</w:t>
+        <w:t>方式 B：源码启动</w:t>
       </w:r>
     </w:p>
     <w:p>
@@ -970,20 +795,6 @@
           <w:b w:val="0"/>
           <w:sz w:val="21"/>
         </w:rPr>
-        <w:t>pip install -r clean_client\requirements.txt</w:t>
-      </w:r>
-    </w:p>
-    <w:p>
-      <w:pPr>
-        <w:spacing w:after="120"/>
-        <w:ind w:left="283"/>
-      </w:pPr>
-      <w:r>
-        <w:rPr>
-          <w:rFonts w:ascii="Consolas" w:hAnsi="Consolas" w:eastAsia="微软雅黑"/>
-          <w:b w:val="0"/>
-          <w:sz w:val="21"/>
-        </w:rPr>
         <w:t>python -m clean_client.app</w:t>
       </w:r>
     </w:p>
@@ -997,7 +808,7 @@
           <w:b/>
           <w:sz w:val="32"/>
         </w:rPr>
-        <w:t>四、软件界面怎么看</w:t>
+        <w:t>四、界面说明</w:t>
       </w:r>
     </w:p>
     <w:p>
@@ -1010,7 +821,7 @@
           <w:b w:val="0"/>
           <w:sz w:val="22"/>
         </w:rPr>
-        <w:t>左侧一般有四个页面：控制台、循环、识别、系统设置。</w:t>
+        <w:t>左侧四个页面：控制台 / 循环 / 识别 / 系统设置。</w:t>
       </w:r>
     </w:p>
     <w:p>
@@ -1023,7 +834,7 @@
           <w:b/>
           <w:sz w:val="26"/>
         </w:rPr>
-        <w:t>1. 控制台（最常用）</w:t>
+        <w:t>1. 控制台</w:t>
       </w:r>
     </w:p>
     <w:tbl>
@@ -1050,7 +861,7 @@
                 <w:b/>
                 <w:sz w:val="21"/>
               </w:rPr>
-              <w:t>你看到的文字</w:t>
+              <w:t>控件</w:t>
             </w:r>
           </w:p>
         </w:tc>
@@ -1082,7 +893,7 @@
                 <w:b/>
                 <w:sz w:val="21"/>
               </w:rPr>
-              <w:t>小白建议</w:t>
+              <w:t>建议</w:t>
             </w:r>
           </w:p>
         </w:tc>
@@ -1100,7 +911,7 @@
                 <w:b w:val="0"/>
                 <w:sz w:val="21"/>
               </w:rPr>
-              <w:t>启动</w:t>
+              <w:t>启动 / 停止</w:t>
             </w:r>
           </w:p>
         </w:tc>
@@ -1116,7 +927,7 @@
                 <w:b w:val="0"/>
                 <w:sz w:val="21"/>
               </w:rPr>
-              <w:t>开始后台循环</w:t>
+              <w:t>开始或结束循环</w:t>
             </w:r>
           </w:p>
         </w:tc>
@@ -1132,57 +943,7 @@
                 <w:b w:val="0"/>
                 <w:sz w:val="21"/>
               </w:rPr>
-              <w:t>确认「只记日志」勾选后再点</w:t>
-            </w:r>
-          </w:p>
-        </w:tc>
-      </w:tr>
-      <w:tr>
-        <w:tc>
-          <w:tcPr>
-            <w:tcW w:type="dxa" w:w="3173"/>
-          </w:tcPr>
-          <w:p>
-            <w:r/>
-            <w:r>
-              <w:rPr>
-                <w:rFonts w:ascii="微软雅黑" w:hAnsi="微软雅黑" w:eastAsia="微软雅黑"/>
-                <w:b w:val="0"/>
-                <w:sz w:val="21"/>
-              </w:rPr>
-              <w:t>停止</w:t>
-            </w:r>
-          </w:p>
-        </w:tc>
-        <w:tc>
-          <w:tcPr>
-            <w:tcW w:type="dxa" w:w="3173"/>
-          </w:tcPr>
-          <w:p>
-            <w:r/>
-            <w:r>
-              <w:rPr>
-                <w:rFonts w:ascii="微软雅黑" w:hAnsi="微软雅黑" w:eastAsia="微软雅黑"/>
-                <w:b w:val="0"/>
-                <w:sz w:val="21"/>
-              </w:rPr>
-              <w:t>结束循环</w:t>
-            </w:r>
-          </w:p>
-        </w:tc>
-        <w:tc>
-          <w:tcPr>
-            <w:tcW w:type="dxa" w:w="3173"/>
-          </w:tcPr>
-          <w:p>
-            <w:r/>
-            <w:r>
-              <w:rPr>
-                <w:rFonts w:ascii="微软雅黑" w:hAnsi="微软雅黑" w:eastAsia="微软雅黑"/>
-                <w:b w:val="0"/>
-                <w:sz w:val="21"/>
-              </w:rPr>
-              <w:t>不用时点停止</w:t>
+              <w:t>先勾选只记日志再启动</w:t>
             </w:r>
           </w:p>
         </w:tc>
@@ -1216,7 +977,7 @@
                 <w:b w:val="0"/>
                 <w:sz w:val="21"/>
               </w:rPr>
-              <w:t>只写日志，不向游戏发按键</w:t>
+              <w:t>不向游戏发键</w:t>
             </w:r>
           </w:p>
         </w:tc>
@@ -1232,7 +993,7 @@
                 <w:b w:val="0"/>
                 <w:sz w:val="21"/>
               </w:rPr>
-              <w:t>默认勾着，务必先保持勾选</w:t>
+              <w:t>默认勾着；取消会确认</w:t>
             </w:r>
           </w:p>
         </w:tc>
@@ -1266,7 +1027,7 @@
                 <w:b w:val="0"/>
                 <w:sz w:val="21"/>
               </w:rPr>
-              <w:t>识别时优先考虑高亮技能</w:t>
+              <w:t>优先选高亮技能</w:t>
             </w:r>
           </w:p>
         </w:tc>
@@ -1282,7 +1043,7 @@
                 <w:b w:val="0"/>
                 <w:sz w:val="21"/>
               </w:rPr>
-              <w:t>可先保持默认</w:t>
+              <w:t>可保持默认</w:t>
             </w:r>
           </w:p>
         </w:tc>
@@ -1316,7 +1077,7 @@
                 <w:b w:val="0"/>
                 <w:sz w:val="21"/>
               </w:rPr>
-              <w:t>怎么抓游戏画面</w:t>
+              <w:t>抓游戏画面方式</w:t>
             </w:r>
           </w:p>
         </w:tc>
@@ -1332,7 +1093,7 @@
                 <w:b w:val="0"/>
                 <w:sz w:val="21"/>
               </w:rPr>
-              <w:t>第一次建议选「空（测试）」</w:t>
+              <w:t>实机用方式一/二/三，勿用空（测试）</w:t>
             </w:r>
           </w:p>
         </w:tc>
@@ -1366,7 +1127,7 @@
                 <w:b w:val="0"/>
                 <w:sz w:val="21"/>
               </w:rPr>
-              <w:t>循环间隔毫秒</w:t>
+              <w:t>循环间隔</w:t>
             </w:r>
           </w:p>
         </w:tc>
@@ -1400,106 +1161,6 @@
                 <w:b w:val="0"/>
                 <w:sz w:val="21"/>
               </w:rPr>
-              <w:t>运行状态 / 待机 / 运行中</w:t>
-            </w:r>
-          </w:p>
-        </w:tc>
-        <w:tc>
-          <w:tcPr>
-            <w:tcW w:type="dxa" w:w="3173"/>
-          </w:tcPr>
-          <w:p>
-            <w:r/>
-            <w:r>
-              <w:rPr>
-                <w:rFonts w:ascii="微软雅黑" w:hAnsi="微软雅黑" w:eastAsia="微软雅黑"/>
-                <w:b w:val="0"/>
-                <w:sz w:val="21"/>
-              </w:rPr>
-              <w:t>当前是否在跑</w:t>
-            </w:r>
-          </w:p>
-        </w:tc>
-        <w:tc>
-          <w:tcPr>
-            <w:tcW w:type="dxa" w:w="3173"/>
-          </w:tcPr>
-          <w:p>
-            <w:r/>
-            <w:r>
-              <w:rPr>
-                <w:rFonts w:ascii="微软雅黑" w:hAnsi="微软雅黑" w:eastAsia="微软雅黑"/>
-                <w:b w:val="0"/>
-                <w:sz w:val="21"/>
-              </w:rPr>
-              <w:t>点启动后应变为运行中</w:t>
-            </w:r>
-          </w:p>
-        </w:tc>
-      </w:tr>
-      <w:tr>
-        <w:tc>
-          <w:tcPr>
-            <w:tcW w:type="dxa" w:w="3173"/>
-          </w:tcPr>
-          <w:p>
-            <w:r/>
-            <w:r>
-              <w:rPr>
-                <w:rFonts w:ascii="微软雅黑" w:hAnsi="微软雅黑" w:eastAsia="微软雅黑"/>
-                <w:b w:val="0"/>
-                <w:sz w:val="21"/>
-              </w:rPr>
-              <w:t>窗口句柄</w:t>
-            </w:r>
-          </w:p>
-        </w:tc>
-        <w:tc>
-          <w:tcPr>
-            <w:tcW w:type="dxa" w:w="3173"/>
-          </w:tcPr>
-          <w:p>
-            <w:r/>
-            <w:r>
-              <w:rPr>
-                <w:rFonts w:ascii="微软雅黑" w:hAnsi="微软雅黑" w:eastAsia="微软雅黑"/>
-                <w:b w:val="0"/>
-                <w:sz w:val="21"/>
-              </w:rPr>
-              <w:t>有没有找到魔兽窗口</w:t>
-            </w:r>
-          </w:p>
-        </w:tc>
-        <w:tc>
-          <w:tcPr>
-            <w:tcW w:type="dxa" w:w="3173"/>
-          </w:tcPr>
-          <w:p>
-            <w:r/>
-            <w:r>
-              <w:rPr>
-                <w:rFonts w:ascii="微软雅黑" w:hAnsi="微软雅黑" w:eastAsia="微软雅黑"/>
-                <w:b w:val="0"/>
-                <w:sz w:val="21"/>
-              </w:rPr>
-              <w:t>找不到也可能先空着，后面再查</w:t>
-            </w:r>
-          </w:p>
-        </w:tc>
-      </w:tr>
-      <w:tr>
-        <w:tc>
-          <w:tcPr>
-            <w:tcW w:type="dxa" w:w="3173"/>
-          </w:tcPr>
-          <w:p>
-            <w:r/>
-            <w:r>
-              <w:rPr>
-                <w:rFonts w:ascii="微软雅黑" w:hAnsi="微软雅黑" w:eastAsia="微软雅黑"/>
-                <w:b w:val="0"/>
-                <w:sz w:val="21"/>
-              </w:rPr>
               <w:t>运行日志</w:t>
             </w:r>
           </w:p>
@@ -1516,7 +1177,7 @@
                 <w:b w:val="0"/>
                 <w:sz w:val="21"/>
               </w:rPr>
-              <w:t>软件输出信息</w:t>
+              <w:t>输出信息</w:t>
             </w:r>
           </w:p>
         </w:tc>
@@ -1532,7 +1193,7 @@
                 <w:b w:val="0"/>
                 <w:sz w:val="21"/>
               </w:rPr>
-              <w:t>重点看这里有没有「空闲 / 动作 / 错误」</w:t>
+              <w:t>关注空闲 / 动作 / 提示 / 错误</w:t>
             </w:r>
           </w:p>
         </w:tc>
@@ -1562,7 +1223,7 @@
           <w:b w:val="0"/>
           <w:sz w:val="22"/>
         </w:rPr>
-        <w:t>这里显示当前加载的技能优先级列表（例如邪恶死亡骑士）。当前版本主要是查看，一般不用改。</w:t>
+        <w:t>显示当前技能优先级（如邪恶 DK）。当前主要查看，一般不用改。</w:t>
       </w:r>
     </w:p>
     <w:p>
@@ -1575,7 +1236,464 @@
           <w:b/>
           <w:sz w:val="26"/>
         </w:rPr>
-        <w:t>3. 识别</w:t>
+        <w:t>3. 识别（重点）</w:t>
+      </w:r>
+    </w:p>
+    <w:tbl>
+      <w:tblPr>
+        <w:tblStyle w:val="TableGrid"/>
+        <w:tblW w:type="auto" w:w="0"/>
+        <w:tblLook w:firstColumn="1" w:firstRow="1" w:lastColumn="0" w:lastRow="0" w:noHBand="0" w:noVBand="1" w:val="04A0"/>
+      </w:tblPr>
+      <w:tblGrid>
+        <w:gridCol w:w="4759"/>
+        <w:gridCol w:w="4759"/>
+      </w:tblGrid>
+      <w:tr>
+        <w:tc>
+          <w:tcPr>
+            <w:tcW w:type="dxa" w:w="4759"/>
+          </w:tcPr>
+          <w:p>
+            <w:r/>
+            <w:r>
+              <w:rPr>
+                <w:rFonts w:ascii="微软雅黑" w:hAnsi="微软雅黑" w:eastAsia="微软雅黑"/>
+                <w:b/>
+                <w:sz w:val="21"/>
+              </w:rPr>
+              <w:t>功能</w:t>
+            </w:r>
+          </w:p>
+        </w:tc>
+        <w:tc>
+          <w:tcPr>
+            <w:tcW w:type="dxa" w:w="4759"/>
+          </w:tcPr>
+          <w:p>
+            <w:r/>
+            <w:r>
+              <w:rPr>
+                <w:rFonts w:ascii="微软雅黑" w:hAnsi="微软雅黑" w:eastAsia="微软雅黑"/>
+                <w:b/>
+                <w:sz w:val="21"/>
+              </w:rPr>
+              <w:t>作用</w:t>
+            </w:r>
+          </w:p>
+        </w:tc>
+      </w:tr>
+      <w:tr>
+        <w:tc>
+          <w:tcPr>
+            <w:tcW w:type="dxa" w:w="4759"/>
+          </w:tcPr>
+          <w:p>
+            <w:r/>
+            <w:r>
+              <w:rPr>
+                <w:rFonts w:ascii="微软雅黑" w:hAnsi="微软雅黑" w:eastAsia="微软雅黑"/>
+                <w:b w:val="0"/>
+                <w:sz w:val="21"/>
+              </w:rPr>
+              <w:t>模拟识别</w:t>
+            </w:r>
+          </w:p>
+        </w:tc>
+        <w:tc>
+          <w:tcPr>
+            <w:tcW w:type="dxa" w:w="4759"/>
+          </w:tcPr>
+          <w:p>
+            <w:r/>
+            <w:r>
+              <w:rPr>
+                <w:rFonts w:ascii="微软雅黑" w:hAnsi="微软雅黑" w:eastAsia="微软雅黑"/>
+                <w:b w:val="0"/>
+                <w:sz w:val="21"/>
+              </w:rPr>
+              <w:t>不读屏，调试用；日志多为空闲</w:t>
+            </w:r>
+          </w:p>
+        </w:tc>
+      </w:tr>
+      <w:tr>
+        <w:tc>
+          <w:tcPr>
+            <w:tcW w:type="dxa" w:w="4759"/>
+          </w:tcPr>
+          <w:p>
+            <w:r/>
+            <w:r>
+              <w:rPr>
+                <w:rFonts w:ascii="微软雅黑" w:hAnsi="微软雅黑" w:eastAsia="微软雅黑"/>
+                <w:b w:val="0"/>
+                <w:sz w:val="21"/>
+              </w:rPr>
+              <w:t>像素协议</w:t>
+            </w:r>
+          </w:p>
+        </w:tc>
+        <w:tc>
+          <w:tcPr>
+            <w:tcW w:type="dxa" w:w="4759"/>
+          </w:tcPr>
+          <w:p>
+            <w:r/>
+            <w:r>
+              <w:rPr>
+                <w:rFonts w:ascii="微软雅黑" w:hAnsi="微软雅黑" w:eastAsia="微软雅黑"/>
+                <w:b w:val="0"/>
+                <w:sz w:val="21"/>
+              </w:rPr>
+              <w:t>读取 AutoPlayer 色块（绑定行 + 冷却/高亮行）</w:t>
+            </w:r>
+          </w:p>
+        </w:tc>
+      </w:tr>
+      <w:tr>
+        <w:tc>
+          <w:tcPr>
+            <w:tcW w:type="dxa" w:w="4759"/>
+          </w:tcPr>
+          <w:p>
+            <w:r/>
+            <w:r>
+              <w:rPr>
+                <w:rFonts w:ascii="微软雅黑" w:hAnsi="微软雅黑" w:eastAsia="微软雅黑"/>
+                <w:b w:val="0"/>
+                <w:sz w:val="21"/>
+              </w:rPr>
+              <w:t>区域目录</w:t>
+            </w:r>
+          </w:p>
+        </w:tc>
+        <w:tc>
+          <w:tcPr>
+            <w:tcW w:type="dxa" w:w="4759"/>
+          </w:tcPr>
+          <w:p>
+            <w:r/>
+            <w:r>
+              <w:rPr>
+                <w:rFonts w:ascii="微软雅黑" w:hAnsi="微软雅黑" w:eastAsia="微软雅黑"/>
+                <w:b w:val="0"/>
+                <w:sz w:val="21"/>
+              </w:rPr>
+              <w:t>Skill/Target/Player/Buff 的 txt 所在文件夹</w:t>
+            </w:r>
+          </w:p>
+        </w:tc>
+      </w:tr>
+      <w:tr>
+        <w:tc>
+          <w:tcPr>
+            <w:tcW w:type="dxa" w:w="4759"/>
+          </w:tcPr>
+          <w:p>
+            <w:r/>
+            <w:r>
+              <w:rPr>
+                <w:rFonts w:ascii="微软雅黑" w:hAnsi="微软雅黑" w:eastAsia="微软雅黑"/>
+                <w:b w:val="0"/>
+                <w:sz w:val="21"/>
+              </w:rPr>
+              <w:t>打开区域标定器</w:t>
+            </w:r>
+          </w:p>
+        </w:tc>
+        <w:tc>
+          <w:tcPr>
+            <w:tcW w:type="dxa" w:w="4759"/>
+          </w:tcPr>
+          <w:p>
+            <w:r/>
+            <w:r>
+              <w:rPr>
+                <w:rFonts w:ascii="微软雅黑" w:hAnsi="微软雅黑" w:eastAsia="微软雅黑"/>
+                <w:b w:val="0"/>
+                <w:sz w:val="21"/>
+              </w:rPr>
+              <w:t>手动框选并保存区域</w:t>
+            </w:r>
+          </w:p>
+        </w:tc>
+      </w:tr>
+      <w:tr>
+        <w:tc>
+          <w:tcPr>
+            <w:tcW w:type="dxa" w:w="4759"/>
+          </w:tcPr>
+          <w:p>
+            <w:r/>
+            <w:r>
+              <w:rPr>
+                <w:rFonts w:ascii="微软雅黑" w:hAnsi="微软雅黑" w:eastAsia="微软雅黑"/>
+                <w:b w:val="0"/>
+                <w:sz w:val="21"/>
+              </w:rPr>
+              <w:t>自动建议 Skill 区域</w:t>
+            </w:r>
+          </w:p>
+        </w:tc>
+        <w:tc>
+          <w:tcPr>
+            <w:tcW w:type="dxa" w:w="4759"/>
+          </w:tcPr>
+          <w:p>
+            <w:r/>
+            <w:r>
+              <w:rPr>
+                <w:rFonts w:ascii="微软雅黑" w:hAnsi="微软雅黑" w:eastAsia="微软雅黑"/>
+                <w:b w:val="0"/>
+                <w:sz w:val="21"/>
+              </w:rPr>
+              <w:t>自动找品红色 START 条并写出 skill_region.txt</w:t>
+            </w:r>
+          </w:p>
+        </w:tc>
+      </w:tr>
+      <w:tr>
+        <w:tc>
+          <w:tcPr>
+            <w:tcW w:type="dxa" w:w="4759"/>
+          </w:tcPr>
+          <w:p>
+            <w:r/>
+            <w:r>
+              <w:rPr>
+                <w:rFonts w:ascii="微软雅黑" w:hAnsi="微软雅黑" w:eastAsia="微软雅黑"/>
+                <w:b w:val="0"/>
+                <w:sz w:val="21"/>
+              </w:rPr>
+              <w:t>抓取预览 / 自动刷新</w:t>
+            </w:r>
+          </w:p>
+        </w:tc>
+        <w:tc>
+          <w:tcPr>
+            <w:tcW w:type="dxa" w:w="4759"/>
+          </w:tcPr>
+          <w:p>
+            <w:r/>
+            <w:r>
+              <w:rPr>
+                <w:rFonts w:ascii="微软雅黑" w:hAnsi="微软雅黑" w:eastAsia="微软雅黑"/>
+                <w:b w:val="0"/>
+                <w:sz w:val="21"/>
+              </w:rPr>
+              <w:t>看截屏和区域框是否对准</w:t>
+            </w:r>
+          </w:p>
+        </w:tc>
+      </w:tr>
+    </w:tbl>
+    <w:p/>
+    <w:p>
+      <w:pPr>
+        <w:pStyle w:val="Heading2"/>
+      </w:pPr>
+      <w:r>
+        <w:rPr>
+          <w:rFonts w:ascii="微软雅黑" w:hAnsi="微软雅黑" w:eastAsia="微软雅黑"/>
+          <w:b/>
+          <w:sz w:val="26"/>
+        </w:rPr>
+        <w:t>4. 系统设置</w:t>
+      </w:r>
+    </w:p>
+    <w:p>
+      <w:pPr>
+        <w:pStyle w:val="ListBullet"/>
+        <w:spacing w:after="40"/>
+      </w:pPr>
+      <w:r>
+        <w:rPr>
+          <w:rFonts w:ascii="微软雅黑" w:hAnsi="微软雅黑" w:eastAsia="微软雅黑"/>
+          <w:b w:val="0"/>
+          <w:sz w:val="22"/>
+        </w:rPr>
+        <w:t>窗口关键字默认含 World of Warcraft、魔兽世界。</w:t>
+      </w:r>
+    </w:p>
+    <w:p>
+      <w:pPr>
+        <w:pStyle w:val="ListBullet"/>
+        <w:spacing w:after="40"/>
+      </w:pPr>
+      <w:r>
+        <w:rPr>
+          <w:rFonts w:ascii="微软雅黑" w:hAnsi="微软雅黑" w:eastAsia="微软雅黑"/>
+          <w:b w:val="0"/>
+          <w:sz w:val="22"/>
+        </w:rPr>
+        <w:t>改完点保存；浏览区域目录后也会自动写入配置。</w:t>
+      </w:r>
+    </w:p>
+    <w:p>
+      <w:pPr>
+        <w:pStyle w:val="Heading1"/>
+      </w:pPr>
+      <w:r>
+        <w:rPr>
+          <w:rFonts w:ascii="微软雅黑" w:hAnsi="微软雅黑" w:eastAsia="微软雅黑"/>
+          <w:b/>
+          <w:sz w:val="32"/>
+        </w:rPr>
+        <w:t>五、推荐完整流程（实机）</w:t>
+      </w:r>
+    </w:p>
+    <w:p>
+      <w:pPr>
+        <w:pStyle w:val="ListNumber"/>
+        <w:spacing w:after="40"/>
+      </w:pPr>
+      <w:r>
+        <w:rPr>
+          <w:rFonts w:ascii="微软雅黑" w:hAnsi="微软雅黑" w:eastAsia="微软雅黑"/>
+          <w:b w:val="0"/>
+          <w:sz w:val="22"/>
+        </w:rPr>
+        <w:t>安装并启用 AutoPlayer。</w:t>
+      </w:r>
+    </w:p>
+    <w:p>
+      <w:pPr>
+        <w:pStyle w:val="ListNumber"/>
+        <w:spacing w:after="40"/>
+      </w:pPr>
+      <w:r>
+        <w:rPr>
+          <w:rFonts w:ascii="微软雅黑" w:hAnsi="微软雅黑" w:eastAsia="微软雅黑"/>
+          <w:b w:val="0"/>
+          <w:sz w:val="22"/>
+        </w:rPr>
+        <w:t>打开 CleanClient.exe。</w:t>
+      </w:r>
+    </w:p>
+    <w:p>
+      <w:pPr>
+        <w:pStyle w:val="ListNumber"/>
+        <w:spacing w:after="40"/>
+      </w:pPr>
+      <w:r>
+        <w:rPr>
+          <w:rFonts w:ascii="微软雅黑" w:hAnsi="微软雅黑" w:eastAsia="微软雅黑"/>
+          <w:b w:val="0"/>
+          <w:sz w:val="22"/>
+        </w:rPr>
+        <w:t>控制台：勾选「只记日志」；截屏选「方式二」（不行再换一/三）。</w:t>
+      </w:r>
+    </w:p>
+    <w:p>
+      <w:pPr>
+        <w:pStyle w:val="ListNumber"/>
+        <w:spacing w:after="40"/>
+      </w:pPr>
+      <w:r>
+        <w:rPr>
+          <w:rFonts w:ascii="微软雅黑" w:hAnsi="微软雅黑" w:eastAsia="微软雅黑"/>
+          <w:b w:val="0"/>
+          <w:sz w:val="22"/>
+        </w:rPr>
+        <w:t>识别页：模式选「像素协议」。</w:t>
+      </w:r>
+    </w:p>
+    <w:p>
+      <w:pPr>
+        <w:pStyle w:val="ListNumber"/>
+        <w:spacing w:after="40"/>
+      </w:pPr>
+      <w:r>
+        <w:rPr>
+          <w:rFonts w:ascii="微软雅黑" w:hAnsi="微软雅黑" w:eastAsia="微软雅黑"/>
+          <w:b w:val="0"/>
+          <w:sz w:val="22"/>
+        </w:rPr>
+        <w:t>点「自动建议 Skill 区域」，再点「抓取预览」，确认蓝框大致罩住色块条。</w:t>
+      </w:r>
+    </w:p>
+    <w:p>
+      <w:pPr>
+        <w:pStyle w:val="ListNumber"/>
+        <w:spacing w:after="40"/>
+      </w:pPr>
+      <w:r>
+        <w:rPr>
+          <w:rFonts w:ascii="微软雅黑" w:hAnsi="微软雅黑" w:eastAsia="微软雅黑"/>
+          <w:b w:val="0"/>
+          <w:sz w:val="22"/>
+        </w:rPr>
+        <w:t>框不准就打开标定器精修并保存（保存后会自动填回区域目录）。</w:t>
+      </w:r>
+    </w:p>
+    <w:p>
+      <w:pPr>
+        <w:pStyle w:val="ListNumber"/>
+        <w:spacing w:after="40"/>
+      </w:pPr>
+      <w:r>
+        <w:rPr>
+          <w:rFonts w:ascii="微软雅黑" w:hAnsi="微软雅黑" w:eastAsia="微软雅黑"/>
+          <w:b w:val="0"/>
+          <w:sz w:val="22"/>
+        </w:rPr>
+        <w:t>回到控制台点「启动」。</w:t>
+      </w:r>
+    </w:p>
+    <w:p>
+      <w:pPr>
+        <w:pStyle w:val="ListNumber"/>
+        <w:spacing w:after="40"/>
+      </w:pPr>
+      <w:r>
+        <w:rPr>
+          <w:rFonts w:ascii="微软雅黑" w:hAnsi="微软雅黑" w:eastAsia="微软雅黑"/>
+          <w:b w:val="0"/>
+          <w:sz w:val="22"/>
+        </w:rPr>
+        <w:t>看日志：先可能有一条「提示:…」；正常时应出现「动作 法术ID=… 按键=…」。</w:t>
+      </w:r>
+    </w:p>
+    <w:p>
+      <w:pPr>
+        <w:pStyle w:val="ListNumber"/>
+        <w:spacing w:after="40"/>
+      </w:pPr>
+      <w:r>
+        <w:rPr>
+          <w:rFonts w:ascii="微软雅黑" w:hAnsi="微软雅黑" w:eastAsia="微软雅黑"/>
+          <w:b w:val="0"/>
+          <w:sz w:val="22"/>
+        </w:rPr>
+        <w:t>确认按键字母/数字符合你的键位后，如需真按键：取消「只记日志」→ 确认 → 再启动。</w:t>
+      </w:r>
+    </w:p>
+    <w:p>
+      <w:pPr>
+        <w:pStyle w:val="ListNumber"/>
+        <w:spacing w:after="40"/>
+      </w:pPr>
+      <w:r>
+        <w:rPr>
+          <w:rFonts w:ascii="微软雅黑" w:hAnsi="微软雅黑" w:eastAsia="微软雅黑"/>
+          <w:b w:val="0"/>
+          <w:sz w:val="22"/>
+        </w:rPr>
+        <w:t>不用时点「停止」。</w:t>
+      </w:r>
+    </w:p>
+    <w:p>
+      <w:pPr>
+        <w:pStyle w:val="Heading1"/>
+      </w:pPr>
+      <w:r>
+        <w:rPr>
+          <w:rFonts w:ascii="微软雅黑" w:hAnsi="微软雅黑" w:eastAsia="微软雅黑"/>
+          <w:b/>
+          <w:sz w:val="32"/>
+        </w:rPr>
+        <w:t>六、截屏方式怎么选</w:t>
       </w:r>
     </w:p>
     <w:tbl>
@@ -1618,7 +1736,7 @@
                 <w:b/>
                 <w:sz w:val="21"/>
               </w:rPr>
-              <w:t>含义</w:t>
+              <w:t>说明</w:t>
             </w:r>
           </w:p>
         </w:tc>
@@ -1634,489 +1752,7 @@
                 <w:b/>
                 <w:sz w:val="21"/>
               </w:rPr>
-              <w:t>现在怎么选</w:t>
-            </w:r>
-          </w:p>
-        </w:tc>
-      </w:tr>
-      <w:tr>
-        <w:tc>
-          <w:tcPr>
-            <w:tcW w:type="dxa" w:w="3173"/>
-          </w:tcPr>
-          <w:p>
-            <w:r/>
-            <w:r>
-              <w:rPr>
-                <w:rFonts w:ascii="微软雅黑" w:hAnsi="微软雅黑" w:eastAsia="微软雅黑"/>
-                <w:b w:val="0"/>
-                <w:sz w:val="21"/>
-              </w:rPr>
-              <w:t>模拟识别（调试）</w:t>
-            </w:r>
-          </w:p>
-        </w:tc>
-        <w:tc>
-          <w:tcPr>
-            <w:tcW w:type="dxa" w:w="3173"/>
-          </w:tcPr>
-          <w:p>
-            <w:r/>
-            <w:r>
-              <w:rPr>
-                <w:rFonts w:ascii="微软雅黑" w:hAnsi="微软雅黑" w:eastAsia="微软雅黑"/>
-                <w:b w:val="0"/>
-                <w:sz w:val="21"/>
-              </w:rPr>
-              <w:t>不读屏幕，假装没有技能</w:t>
-            </w:r>
-          </w:p>
-        </w:tc>
-        <w:tc>
-          <w:tcPr>
-            <w:tcW w:type="dxa" w:w="3173"/>
-          </w:tcPr>
-          <w:p>
-            <w:r/>
-            <w:r>
-              <w:rPr>
-                <w:rFonts w:ascii="微软雅黑" w:hAnsi="微软雅黑" w:eastAsia="微软雅黑"/>
-                <w:b w:val="0"/>
-                <w:sz w:val="21"/>
-              </w:rPr>
-              <w:t>当前默认，试用时用这个</w:t>
-            </w:r>
-          </w:p>
-        </w:tc>
-      </w:tr>
-      <w:tr>
-        <w:tc>
-          <w:tcPr>
-            <w:tcW w:type="dxa" w:w="3173"/>
-          </w:tcPr>
-          <w:p>
-            <w:r/>
-            <w:r>
-              <w:rPr>
-                <w:rFonts w:ascii="微软雅黑" w:hAnsi="微软雅黑" w:eastAsia="微软雅黑"/>
-                <w:b w:val="0"/>
-                <w:sz w:val="21"/>
-              </w:rPr>
-              <w:t>像素协议（真实色块）</w:t>
-            </w:r>
-          </w:p>
-        </w:tc>
-        <w:tc>
-          <w:tcPr>
-            <w:tcW w:type="dxa" w:w="3173"/>
-          </w:tcPr>
-          <w:p>
-            <w:r/>
-            <w:r>
-              <w:rPr>
-                <w:rFonts w:ascii="微软雅黑" w:hAnsi="微软雅黑" w:eastAsia="微软雅黑"/>
-                <w:b w:val="0"/>
-                <w:sz w:val="21"/>
-              </w:rPr>
-              <w:t>读取 AutoPlayer 画出的色块</w:t>
-            </w:r>
-          </w:p>
-        </w:tc>
-        <w:tc>
-          <w:tcPr>
-            <w:tcW w:type="dxa" w:w="3173"/>
-          </w:tcPr>
-          <w:p>
-            <w:r/>
-            <w:r>
-              <w:rPr>
-                <w:rFonts w:ascii="微软雅黑" w:hAnsi="微软雅黑" w:eastAsia="微软雅黑"/>
-                <w:b w:val="0"/>
-                <w:sz w:val="21"/>
-              </w:rPr>
-              <w:t>以后接好真实识别再用</w:t>
-            </w:r>
-          </w:p>
-        </w:tc>
-      </w:tr>
-      <w:tr>
-        <w:tc>
-          <w:tcPr>
-            <w:tcW w:type="dxa" w:w="3173"/>
-          </w:tcPr>
-          <w:p>
-            <w:r/>
-            <w:r>
-              <w:rPr>
-                <w:rFonts w:ascii="微软雅黑" w:hAnsi="微软雅黑" w:eastAsia="微软雅黑"/>
-                <w:b w:val="0"/>
-                <w:sz w:val="21"/>
-              </w:rPr>
-              <w:t>区域目录</w:t>
-            </w:r>
-          </w:p>
-        </w:tc>
-        <w:tc>
-          <w:tcPr>
-            <w:tcW w:type="dxa" w:w="3173"/>
-          </w:tcPr>
-          <w:p>
-            <w:r/>
-            <w:r>
-              <w:rPr>
-                <w:rFonts w:ascii="微软雅黑" w:hAnsi="微软雅黑" w:eastAsia="微软雅黑"/>
-                <w:b w:val="0"/>
-                <w:sz w:val="21"/>
-              </w:rPr>
-              <w:t>Skill/Target/Player/Buff 区域文件所在文件夹</w:t>
-            </w:r>
-          </w:p>
-        </w:tc>
-        <w:tc>
-          <w:tcPr>
-            <w:tcW w:type="dxa" w:w="3173"/>
-          </w:tcPr>
-          <w:p>
-            <w:r/>
-            <w:r>
-              <w:rPr>
-                <w:rFonts w:ascii="微软雅黑" w:hAnsi="微软雅黑" w:eastAsia="微软雅黑"/>
-                <w:b w:val="0"/>
-                <w:sz w:val="21"/>
-              </w:rPr>
-              <w:t>标定保存后可在这里指定</w:t>
-            </w:r>
-          </w:p>
-        </w:tc>
-      </w:tr>
-      <w:tr>
-        <w:tc>
-          <w:tcPr>
-            <w:tcW w:type="dxa" w:w="3173"/>
-          </w:tcPr>
-          <w:p>
-            <w:r/>
-            <w:r>
-              <w:rPr>
-                <w:rFonts w:ascii="微软雅黑" w:hAnsi="微软雅黑" w:eastAsia="微软雅黑"/>
-                <w:b w:val="0"/>
-                <w:sz w:val="21"/>
-              </w:rPr>
-              <w:t>打开标定器</w:t>
-            </w:r>
-          </w:p>
-        </w:tc>
-        <w:tc>
-          <w:tcPr>
-            <w:tcW w:type="dxa" w:w="3173"/>
-          </w:tcPr>
-          <w:p>
-            <w:r/>
-            <w:r>
-              <w:rPr>
-                <w:rFonts w:ascii="微软雅黑" w:hAnsi="微软雅黑" w:eastAsia="微软雅黑"/>
-                <w:b w:val="0"/>
-                <w:sz w:val="21"/>
-              </w:rPr>
-              <w:t>弹出框选区域的工具</w:t>
-            </w:r>
-          </w:p>
-        </w:tc>
-        <w:tc>
-          <w:tcPr>
-            <w:tcW w:type="dxa" w:w="3173"/>
-          </w:tcPr>
-          <w:p>
-            <w:r/>
-            <w:r>
-              <w:rPr>
-                <w:rFonts w:ascii="微软雅黑" w:hAnsi="微软雅黑" w:eastAsia="微软雅黑"/>
-                <w:b w:val="0"/>
-                <w:sz w:val="21"/>
-              </w:rPr>
-              <w:t>想练习框选时点它</w:t>
-            </w:r>
-          </w:p>
-        </w:tc>
-      </w:tr>
-    </w:tbl>
-    <w:p/>
-    <w:p>
-      <w:pPr>
-        <w:pStyle w:val="Heading2"/>
-      </w:pPr>
-      <w:r>
-        <w:rPr>
-          <w:rFonts w:ascii="微软雅黑" w:hAnsi="微软雅黑" w:eastAsia="微软雅黑"/>
-          <w:b/>
-          <w:sz w:val="26"/>
-        </w:rPr>
-        <w:t>4. 系统设置</w:t>
-      </w:r>
-    </w:p>
-    <w:p>
-      <w:pPr>
-        <w:pStyle w:val="ListBullet"/>
-        <w:spacing w:after="40"/>
-      </w:pPr>
-      <w:r>
-        <w:rPr>
-          <w:rFonts w:ascii="微软雅黑" w:hAnsi="微软雅黑" w:eastAsia="微软雅黑"/>
-          <w:b w:val="0"/>
-          <w:sz w:val="22"/>
-        </w:rPr>
-        <w:t>窗口关键字：默认包含 World of Warcraft、魔兽世界，用于查找游戏窗口。</w:t>
-      </w:r>
-    </w:p>
-    <w:p>
-      <w:pPr>
-        <w:pStyle w:val="ListBullet"/>
-        <w:spacing w:after="40"/>
-      </w:pPr>
-      <w:r>
-        <w:rPr>
-          <w:rFonts w:ascii="微软雅黑" w:hAnsi="微软雅黑" w:eastAsia="微软雅黑"/>
-          <w:b w:val="0"/>
-          <w:sz w:val="22"/>
-        </w:rPr>
-        <w:t>冷却就绪窗口、增益匹配阈值：高级参数，小白先保持默认。</w:t>
-      </w:r>
-    </w:p>
-    <w:p>
-      <w:pPr>
-        <w:pStyle w:val="ListBullet"/>
-        <w:spacing w:after="40"/>
-      </w:pPr>
-      <w:r>
-        <w:rPr>
-          <w:rFonts w:ascii="微软雅黑" w:hAnsi="微软雅黑" w:eastAsia="微软雅黑"/>
-          <w:b w:val="0"/>
-          <w:sz w:val="22"/>
-        </w:rPr>
-        <w:t>改完后如有保存按钮 / 提示，按界面提示保存到本地配置。</w:t>
-      </w:r>
-    </w:p>
-    <w:p>
-      <w:pPr>
-        <w:pStyle w:val="Heading1"/>
-      </w:pPr>
-      <w:r>
-        <w:rPr>
-          <w:rFonts w:ascii="微软雅黑" w:hAnsi="微软雅黑" w:eastAsia="微软雅黑"/>
-          <w:b/>
-          <w:sz w:val="32"/>
-        </w:rPr>
-        <w:t>五、第一次安全试用（强烈建议按这个做）</w:t>
-      </w:r>
-    </w:p>
-    <w:p>
-      <w:pPr>
-        <w:spacing w:after="120" w:line="360" w:lineRule="auto"/>
-      </w:pPr>
-      <w:r>
-        <w:rPr>
-          <w:rFonts w:ascii="微软雅黑" w:hAnsi="微软雅黑" w:eastAsia="微软雅黑"/>
-          <w:b w:val="0"/>
-          <w:sz w:val="22"/>
-        </w:rPr>
-        <w:t>目标：确认软件能打开、能启动、能出日志。不追求自动打怪。</w:t>
-      </w:r>
-    </w:p>
-    <w:p>
-      <w:pPr>
-        <w:pStyle w:val="ListNumber"/>
-        <w:spacing w:after="40"/>
-      </w:pPr>
-      <w:r>
-        <w:rPr>
-          <w:rFonts w:ascii="微软雅黑" w:hAnsi="微软雅黑" w:eastAsia="微软雅黑"/>
-          <w:b w:val="0"/>
-          <w:sz w:val="22"/>
-        </w:rPr>
-        <w:t>确认魔兽可以正常进入（插件已勾选更好，但第一次即使没装插件也能先测软件本身）。</w:t>
-      </w:r>
-    </w:p>
-    <w:p>
-      <w:pPr>
-        <w:pStyle w:val="ListNumber"/>
-        <w:spacing w:after="40"/>
-      </w:pPr>
-      <w:r>
-        <w:rPr>
-          <w:rFonts w:ascii="微软雅黑" w:hAnsi="微软雅黑" w:eastAsia="微软雅黑"/>
-          <w:b w:val="0"/>
-          <w:sz w:val="22"/>
-        </w:rPr>
-        <w:t>打开 CleanClient.exe。</w:t>
-      </w:r>
-    </w:p>
-    <w:p>
-      <w:pPr>
-        <w:pStyle w:val="ListNumber"/>
-        <w:spacing w:after="40"/>
-      </w:pPr>
-      <w:r>
-        <w:rPr>
-          <w:rFonts w:ascii="微软雅黑" w:hAnsi="微软雅黑" w:eastAsia="微软雅黑"/>
-          <w:b w:val="0"/>
-          <w:sz w:val="22"/>
-        </w:rPr>
-        <w:t>进入「控制台」。</w:t>
-      </w:r>
-    </w:p>
-    <w:p>
-      <w:pPr>
-        <w:pStyle w:val="ListNumber"/>
-        <w:spacing w:after="40"/>
-      </w:pPr>
-      <w:r>
-        <w:rPr>
-          <w:rFonts w:ascii="微软雅黑" w:hAnsi="微软雅黑" w:eastAsia="微软雅黑"/>
-          <w:b w:val="0"/>
-          <w:sz w:val="22"/>
-        </w:rPr>
-        <w:t>确认已勾选「只记日志，不按键」。</w:t>
-      </w:r>
-    </w:p>
-    <w:p>
-      <w:pPr>
-        <w:pStyle w:val="ListNumber"/>
-        <w:spacing w:after="40"/>
-      </w:pPr>
-      <w:r>
-        <w:rPr>
-          <w:rFonts w:ascii="微软雅黑" w:hAnsi="微软雅黑" w:eastAsia="微软雅黑"/>
-          <w:b w:val="0"/>
-          <w:sz w:val="22"/>
-        </w:rPr>
-        <w:t>截屏方式先选「空（测试）」。</w:t>
-      </w:r>
-    </w:p>
-    <w:p>
-      <w:pPr>
-        <w:pStyle w:val="ListNumber"/>
-        <w:spacing w:after="40"/>
-      </w:pPr>
-      <w:r>
-        <w:rPr>
-          <w:rFonts w:ascii="微软雅黑" w:hAnsi="微软雅黑" w:eastAsia="微软雅黑"/>
-          <w:b w:val="0"/>
-          <w:sz w:val="22"/>
-        </w:rPr>
-        <w:t>点「启动」。</w:t>
-      </w:r>
-    </w:p>
-    <w:p>
-      <w:pPr>
-        <w:pStyle w:val="ListNumber"/>
-        <w:spacing w:after="40"/>
-      </w:pPr>
-      <w:r>
-        <w:rPr>
-          <w:rFonts w:ascii="微软雅黑" w:hAnsi="微软雅黑" w:eastAsia="微软雅黑"/>
-          <w:b w:val="0"/>
-          <w:sz w:val="22"/>
-        </w:rPr>
-        <w:t>看运行日志：多半会出现「空闲」。这表示循环在跑，但当前是模拟识别，没有读到真实技能。</w:t>
-      </w:r>
-    </w:p>
-    <w:p>
-      <w:pPr>
-        <w:pStyle w:val="ListNumber"/>
-        <w:spacing w:after="40"/>
-      </w:pPr>
-      <w:r>
-        <w:rPr>
-          <w:rFonts w:ascii="微软雅黑" w:hAnsi="微软雅黑" w:eastAsia="微软雅黑"/>
-          <w:b w:val="0"/>
-          <w:sz w:val="22"/>
-        </w:rPr>
-        <w:t>点「停止」结束。</w:t>
-      </w:r>
-    </w:p>
-    <w:p>
-      <w:pPr>
-        <w:spacing w:after="120" w:line="360" w:lineRule="auto"/>
-      </w:pPr>
-      <w:r>
-        <w:rPr>
-          <w:rFonts w:ascii="微软雅黑" w:hAnsi="微软雅黑" w:eastAsia="微软雅黑"/>
-          <w:b/>
-          <w:sz w:val="22"/>
-        </w:rPr>
-        <w:t>只要能启动、能停止、日志有输出，就说明软件本体工作正常。</w:t>
-      </w:r>
-    </w:p>
-    <w:p>
-      <w:pPr>
-        <w:pStyle w:val="Heading1"/>
-      </w:pPr>
-      <w:r>
-        <w:rPr>
-          <w:rFonts w:ascii="微软雅黑" w:hAnsi="微软雅黑" w:eastAsia="微软雅黑"/>
-          <w:b/>
-          <w:sz w:val="32"/>
-        </w:rPr>
-        <w:t>六、截屏方式怎么选</w:t>
-      </w:r>
-    </w:p>
-    <w:tbl>
-      <w:tblPr>
-        <w:tblStyle w:val="TableGrid"/>
-        <w:tblW w:type="auto" w:w="0"/>
-        <w:tblLook w:firstColumn="1" w:firstRow="1" w:lastColumn="0" w:lastRow="0" w:noHBand="0" w:noVBand="1" w:val="04A0"/>
-      </w:tblPr>
-      <w:tblGrid>
-        <w:gridCol w:w="3173"/>
-        <w:gridCol w:w="3173"/>
-        <w:gridCol w:w="3173"/>
-      </w:tblGrid>
-      <w:tr>
-        <w:tc>
-          <w:tcPr>
-            <w:tcW w:type="dxa" w:w="3173"/>
-          </w:tcPr>
-          <w:p>
-            <w:r/>
-            <w:r>
-              <w:rPr>
-                <w:rFonts w:ascii="微软雅黑" w:hAnsi="微软雅黑" w:eastAsia="微软雅黑"/>
-                <w:b/>
-                <w:sz w:val="21"/>
-              </w:rPr>
-              <w:t>界面选项</w:t>
-            </w:r>
-          </w:p>
-        </w:tc>
-        <w:tc>
-          <w:tcPr>
-            <w:tcW w:type="dxa" w:w="3173"/>
-          </w:tcPr>
-          <w:p>
-            <w:r/>
-            <w:r>
-              <w:rPr>
-                <w:rFonts w:ascii="微软雅黑" w:hAnsi="微软雅黑" w:eastAsia="微软雅黑"/>
-                <w:b/>
-                <w:sz w:val="21"/>
-              </w:rPr>
-              <w:t>简单理解</w:t>
-            </w:r>
-          </w:p>
-        </w:tc>
-        <w:tc>
-          <w:tcPr>
-            <w:tcW w:type="dxa" w:w="3173"/>
-          </w:tcPr>
-          <w:p>
-            <w:r/>
-            <w:r>
-              <w:rPr>
-                <w:rFonts w:ascii="微软雅黑" w:hAnsi="微软雅黑" w:eastAsia="微软雅黑"/>
-                <w:b/>
-                <w:sz w:val="21"/>
-              </w:rPr>
-              <w:t>什么时候用</w:t>
+              <w:t>何时用</w:t>
             </w:r>
           </w:p>
         </w:tc>
@@ -2150,7 +1786,7 @@
                 <w:b w:val="0"/>
                 <w:sz w:val="21"/>
               </w:rPr>
-              <w:t>不真正截屏</w:t>
+              <w:t>不真截屏</w:t>
             </w:r>
           </w:p>
         </w:tc>
@@ -2166,7 +1802,7 @@
                 <w:b w:val="0"/>
                 <w:sz w:val="21"/>
               </w:rPr>
-              <w:t>第一次试用、排查界面</w:t>
+              <w:t>只测界面；像素协议下会拒绝启动</w:t>
             </w:r>
           </w:p>
         </w:tc>
@@ -2200,7 +1836,7 @@
                 <w:b w:val="0"/>
                 <w:sz w:val="21"/>
               </w:rPr>
-              <w:t>按窗口内容抓图（PrintWindow）</w:t>
+              <w:t>PrintWindow 抓窗口</w:t>
             </w:r>
           </w:p>
         </w:tc>
@@ -2216,7 +1852,7 @@
                 <w:b w:val="0"/>
                 <w:sz w:val="21"/>
               </w:rPr>
-              <w:t>窗口模式可优先试</w:t>
+              <w:t>窗口模式可试；需找到魔兽窗口</w:t>
             </w:r>
           </w:p>
         </w:tc>
@@ -2250,7 +1886,7 @@
                 <w:b w:val="0"/>
                 <w:sz w:val="21"/>
               </w:rPr>
-              <w:t>抓屏幕上实际看到的画面（MSS）</w:t>
+              <w:t>MSS 抓可见画面</w:t>
             </w:r>
           </w:p>
         </w:tc>
@@ -2266,7 +1902,7 @@
                 <w:b w:val="0"/>
                 <w:sz w:val="21"/>
               </w:rPr>
-              <w:t>一般最稳妥，常作首选</w:t>
+              <w:t>通常最稳，优先</w:t>
             </w:r>
           </w:p>
         </w:tc>
@@ -2300,7 +1936,7 @@
                 <w:b w:val="0"/>
                 <w:sz w:val="21"/>
               </w:rPr>
-              <w:t>更快的桌面复制（DXGI/dxcam）</w:t>
+              <w:t>DXGI/dxcam</w:t>
             </w:r>
           </w:p>
         </w:tc>
@@ -2316,55 +1952,13 @@
                 <w:b w:val="0"/>
                 <w:sz w:val="21"/>
               </w:rPr>
-              <w:t>方式二不行或想更快时再试</w:t>
+              <w:t>更快；方式二不行时再试</w:t>
             </w:r>
           </w:p>
         </w:tc>
       </w:tr>
     </w:tbl>
     <w:p/>
-    <w:p>
-      <w:pPr>
-        <w:pStyle w:val="ListBullet"/>
-        <w:spacing w:after="40"/>
-      </w:pPr>
-      <w:r>
-        <w:rPr>
-          <w:rFonts w:ascii="微软雅黑" w:hAnsi="微软雅黑" w:eastAsia="微软雅黑"/>
-          <w:b w:val="0"/>
-          <w:sz w:val="22"/>
-        </w:rPr>
-        <w:t>某种方式黑屏、报错、抓不到图：换另一种即可。</w:t>
-      </w:r>
-    </w:p>
-    <w:p>
-      <w:pPr>
-        <w:pStyle w:val="ListBullet"/>
-        <w:spacing w:after="40"/>
-      </w:pPr>
-      <w:r>
-        <w:rPr>
-          <w:rFonts w:ascii="微软雅黑" w:hAnsi="微软雅黑" w:eastAsia="微软雅黑"/>
-          <w:b w:val="0"/>
-          <w:sz w:val="22"/>
-        </w:rPr>
-        <w:t>全屏独占、HDR、多显示器有时会导致某种方式失败，这属于环境差异，不是你操作错了。</w:t>
-      </w:r>
-    </w:p>
-    <w:p>
-      <w:pPr>
-        <w:pStyle w:val="ListBullet"/>
-        <w:spacing w:after="40"/>
-      </w:pPr>
-      <w:r>
-        <w:rPr>
-          <w:rFonts w:ascii="微软雅黑" w:hAnsi="微软雅黑" w:eastAsia="微软雅黑"/>
-          <w:b w:val="0"/>
-          <w:sz w:val="22"/>
-        </w:rPr>
-        <w:t>做区域标定时，尽量让截屏方式和以后正式使用时一致。</w:t>
-      </w:r>
-    </w:p>
     <w:p>
       <w:pPr>
         <w:pStyle w:val="Heading1"/>
@@ -2375,183 +1969,7 @@
           <w:b/>
           <w:sz w:val="32"/>
         </w:rPr>
-        <w:t>七、区域标定（给以后真实识别做准备）</w:t>
-      </w:r>
-    </w:p>
-    <w:p>
-      <w:pPr>
-        <w:spacing w:after="120" w:line="360" w:lineRule="auto"/>
-      </w:pPr>
-      <w:r>
-        <w:rPr>
-          <w:rFonts w:ascii="微软雅黑" w:hAnsi="微软雅黑" w:eastAsia="微软雅黑"/>
-          <w:b w:val="0"/>
-          <w:sz w:val="22"/>
-        </w:rPr>
-        <w:t>标定的意思：在游戏画面上框出软件要盯着看的几个区域，例如技能条色块区。</w:t>
-      </w:r>
-    </w:p>
-    <w:p>
-      <w:pPr>
-        <w:spacing w:after="120" w:line="360" w:lineRule="auto"/>
-      </w:pPr>
-      <w:r>
-        <w:rPr>
-          <w:rFonts w:ascii="微软雅黑" w:hAnsi="微软雅黑" w:eastAsia="微软雅黑"/>
-          <w:b w:val="0"/>
-          <w:sz w:val="22"/>
-        </w:rPr>
-        <w:t>打开方式：</w:t>
-      </w:r>
-    </w:p>
-    <w:p>
-      <w:pPr>
-        <w:pStyle w:val="ListBullet"/>
-        <w:spacing w:after="40"/>
-      </w:pPr>
-      <w:r>
-        <w:rPr>
-          <w:rFonts w:ascii="微软雅黑" w:hAnsi="微软雅黑" w:eastAsia="微软雅黑"/>
-          <w:b w:val="0"/>
-          <w:sz w:val="22"/>
-        </w:rPr>
-        <w:t>在软件「识别」页点击「打开标定器」；或</w:t>
-      </w:r>
-    </w:p>
-    <w:p>
-      <w:pPr>
-        <w:pStyle w:val="ListBullet"/>
-        <w:spacing w:after="40"/>
-      </w:pPr>
-      <w:r>
-        <w:rPr>
-          <w:rFonts w:ascii="微软雅黑" w:hAnsi="微软雅黑" w:eastAsia="微软雅黑"/>
-          <w:b w:val="0"/>
-          <w:sz w:val="22"/>
-        </w:rPr>
-        <w:t>命令行运行：python -m clean_client.tools.calibrate_regions</w:t>
-      </w:r>
-    </w:p>
-    <w:p>
-      <w:pPr>
-        <w:spacing w:after="120" w:line="360" w:lineRule="auto"/>
-      </w:pPr>
-      <w:r>
-        <w:rPr>
-          <w:rFonts w:ascii="微软雅黑" w:hAnsi="微软雅黑" w:eastAsia="微软雅黑"/>
-          <w:b w:val="0"/>
-          <w:sz w:val="22"/>
-        </w:rPr>
-        <w:t>建议练习流程：</w:t>
-      </w:r>
-    </w:p>
-    <w:p>
-      <w:pPr>
-        <w:pStyle w:val="ListNumber"/>
-        <w:spacing w:after="40"/>
-      </w:pPr>
-      <w:r>
-        <w:rPr>
-          <w:rFonts w:ascii="微软雅黑" w:hAnsi="微软雅黑" w:eastAsia="微软雅黑"/>
-          <w:b w:val="0"/>
-          <w:sz w:val="22"/>
-        </w:rPr>
-        <w:t>截屏先选「空（测试）」，点「抓取画面」，先熟悉界面。</w:t>
-      </w:r>
-    </w:p>
-    <w:p>
-      <w:pPr>
-        <w:pStyle w:val="ListNumber"/>
-        <w:spacing w:after="40"/>
-      </w:pPr>
-      <w:r>
-        <w:rPr>
-          <w:rFonts w:ascii="微软雅黑" w:hAnsi="微软雅黑" w:eastAsia="微软雅黑"/>
-          <w:b w:val="0"/>
-          <w:sz w:val="22"/>
-        </w:rPr>
-        <w:t>选择区域类型：技能 / 目标 / 玩家 / 增益。</w:t>
-      </w:r>
-    </w:p>
-    <w:p>
-      <w:pPr>
-        <w:pStyle w:val="ListNumber"/>
-        <w:spacing w:after="40"/>
-      </w:pPr>
-      <w:r>
-        <w:rPr>
-          <w:rFonts w:ascii="微软雅黑" w:hAnsi="微软雅黑" w:eastAsia="微软雅黑"/>
-          <w:b w:val="0"/>
-          <w:sz w:val="22"/>
-        </w:rPr>
-        <w:t>在图上按住鼠标拖拽框选；也可以改左侧数字坐标。</w:t>
-      </w:r>
-    </w:p>
-    <w:p>
-      <w:pPr>
-        <w:pStyle w:val="ListNumber"/>
-        <w:spacing w:after="40"/>
-      </w:pPr>
-      <w:r>
-        <w:rPr>
-          <w:rFonts w:ascii="微软雅黑" w:hAnsi="微软雅黑" w:eastAsia="微软雅黑"/>
-          <w:b w:val="0"/>
-          <w:sz w:val="22"/>
-        </w:rPr>
-        <w:t>点「保存区域」，选一个文件夹保存。</w:t>
-      </w:r>
-    </w:p>
-    <w:p>
-      <w:pPr>
-        <w:pStyle w:val="ListNumber"/>
-        <w:spacing w:after="40"/>
-      </w:pPr>
-      <w:r>
-        <w:rPr>
-          <w:rFonts w:ascii="微软雅黑" w:hAnsi="微软雅黑" w:eastAsia="微软雅黑"/>
-          <w:b w:val="0"/>
-          <w:sz w:val="22"/>
-        </w:rPr>
-        <w:t>保存后通常会生成 skill_region.txt、target_region.txt、player_region.txt、buff_region.txt。</w:t>
-      </w:r>
-    </w:p>
-    <w:p>
-      <w:pPr>
-        <w:spacing w:after="120" w:line="360" w:lineRule="auto"/>
-      </w:pPr>
-      <w:r>
-        <w:rPr>
-          <w:rFonts w:ascii="微软雅黑" w:hAnsi="微软雅黑" w:eastAsia="微软雅黑"/>
-          <w:b w:val="0"/>
-          <w:sz w:val="22"/>
-        </w:rPr>
-        <w:t>实机标定时：先打开魔兽并启用 AutoPlayer，再用方式一/二/三抓真实画面，重点框准技能（Skill）色块区域。</w:t>
-      </w:r>
-    </w:p>
-    <w:p>
-      <w:pPr>
-        <w:spacing w:after="120" w:line="360" w:lineRule="auto"/>
-      </w:pPr>
-      <w:r>
-        <w:rPr>
-          <w:rFonts w:ascii="微软雅黑" w:hAnsi="微软雅黑" w:eastAsia="微软雅黑"/>
-          <w:b/>
-          <w:sz w:val="22"/>
-        </w:rPr>
-        <w:t>说明：标定文件是为后续真实识别准备的。若当前版本主界面还没有完全自动读取你的标定目录，属于功能尚未接完，不是你保存失败。</w:t>
-      </w:r>
-    </w:p>
-    <w:p>
-      <w:pPr>
-        <w:pStyle w:val="Heading1"/>
-      </w:pPr>
-      <w:r>
-        <w:rPr>
-          <w:rFonts w:ascii="微软雅黑" w:hAnsi="微软雅黑" w:eastAsia="微软雅黑"/>
-          <w:b/>
-          <w:sz w:val="32"/>
-        </w:rPr>
-        <w:t>八、现在做得到 / 做不到什么</w:t>
+        <w:t>七、现在能做什么 / 不能做什么</w:t>
       </w:r>
     </w:p>
     <w:tbl>
@@ -2593,7 +2011,7 @@
                 <w:b/>
                 <w:sz w:val="21"/>
               </w:rPr>
-              <w:t>当前状态</w:t>
+              <w:t>状态</w:t>
             </w:r>
           </w:p>
         </w:tc>
@@ -2611,7 +2029,7 @@
                 <w:b w:val="0"/>
                 <w:sz w:val="21"/>
               </w:rPr>
-              <w:t>打开中文界面</w:t>
+              <w:t>中文界面、启停、只记日志</w:t>
             </w:r>
           </w:p>
         </w:tc>
@@ -2645,7 +2063,7 @@
                 <w:b w:val="0"/>
                 <w:sz w:val="21"/>
               </w:rPr>
-              <w:t>启动 / 停止循环</w:t>
+              <w:t>标定 / 自动建议 Skill / 预览</w:t>
             </w:r>
           </w:p>
         </w:tc>
@@ -2679,7 +2097,7 @@
                 <w:b w:val="0"/>
                 <w:sz w:val="21"/>
               </w:rPr>
-              <w:t>只记日志，不按键</w:t>
+              <w:t>像素协议读绑定 + 冷却/高亮（v1）</w:t>
             </w:r>
           </w:p>
         </w:tc>
@@ -2695,7 +2113,7 @@
                 <w:b w:val="0"/>
                 <w:sz w:val="21"/>
               </w:rPr>
-              <w:t>可以（默认开启）</w:t>
+              <w:t>可以（依赖插件编码一致）</w:t>
             </w:r>
           </w:p>
         </w:tc>
@@ -2713,7 +2131,7 @@
                 <w:b w:val="0"/>
                 <w:sz w:val="21"/>
               </w:rPr>
-              <w:t>查看循环技能列表</w:t>
+              <w:t>确认后真按键</w:t>
             </w:r>
           </w:p>
         </w:tc>
@@ -2729,7 +2147,7 @@
                 <w:b w:val="0"/>
                 <w:sz w:val="21"/>
               </w:rPr>
-              <w:t>可以</w:t>
+              <w:t>可以（有风险，需自行确认）</w:t>
             </w:r>
           </w:p>
         </w:tc>
@@ -2747,75 +2165,7 @@
                 <w:b w:val="0"/>
                 <w:sz w:val="21"/>
               </w:rPr>
-              <w:t>练习区域标定</w:t>
-            </w:r>
-          </w:p>
-        </w:tc>
-        <w:tc>
-          <w:tcPr>
-            <w:tcW w:type="dxa" w:w="4759"/>
-          </w:tcPr>
-          <w:p>
-            <w:r/>
-            <w:r>
-              <w:rPr>
-                <w:rFonts w:ascii="微软雅黑" w:hAnsi="微软雅黑" w:eastAsia="微软雅黑"/>
-                <w:b w:val="0"/>
-                <w:sz w:val="21"/>
-              </w:rPr>
-              <w:t>可以</w:t>
-            </w:r>
-          </w:p>
-        </w:tc>
-      </w:tr>
-      <w:tr>
-        <w:tc>
-          <w:tcPr>
-            <w:tcW w:type="dxa" w:w="4759"/>
-          </w:tcPr>
-          <w:p>
-            <w:r/>
-            <w:r>
-              <w:rPr>
-                <w:rFonts w:ascii="微软雅黑" w:hAnsi="微软雅黑" w:eastAsia="微软雅黑"/>
-                <w:b w:val="0"/>
-                <w:sz w:val="21"/>
-              </w:rPr>
-              <w:t>自动打怪 / 自动按键输出</w:t>
-            </w:r>
-          </w:p>
-        </w:tc>
-        <w:tc>
-          <w:tcPr>
-            <w:tcW w:type="dxa" w:w="4759"/>
-          </w:tcPr>
-          <w:p>
-            <w:r/>
-            <w:r>
-              <w:rPr>
-                <w:rFonts w:ascii="微软雅黑" w:hAnsi="微软雅黑" w:eastAsia="微软雅黑"/>
-                <w:b w:val="0"/>
-                <w:sz w:val="21"/>
-              </w:rPr>
-              <w:t>默认不会；真实识别也尚未完全接好</w:t>
-            </w:r>
-          </w:p>
-        </w:tc>
-      </w:tr>
-      <w:tr>
-        <w:tc>
-          <w:tcPr>
-            <w:tcW w:type="dxa" w:w="4759"/>
-          </w:tcPr>
-          <w:p>
-            <w:r/>
-            <w:r>
-              <w:rPr>
-                <w:rFonts w:ascii="微软雅黑" w:hAnsi="微软雅黑" w:eastAsia="微软雅黑"/>
-                <w:b w:val="0"/>
-                <w:sz w:val="21"/>
-              </w:rPr>
-              <w:t>免登录使用</w:t>
+              <w:t>免登录</w:t>
             </w:r>
           </w:p>
         </w:tc>
@@ -2836,6 +2186,74 @@
           </w:p>
         </w:tc>
       </w:tr>
+      <w:tr>
+        <w:tc>
+          <w:tcPr>
+            <w:tcW w:type="dxa" w:w="4759"/>
+          </w:tcPr>
+          <w:p>
+            <w:r/>
+            <w:r>
+              <w:rPr>
+                <w:rFonts w:ascii="微软雅黑" w:hAnsi="微软雅黑" w:eastAsia="微软雅黑"/>
+                <w:b w:val="0"/>
+                <w:sz w:val="21"/>
+              </w:rPr>
+              <w:t>完整原版一切协议 / 自动找全区域</w:t>
+            </w:r>
+          </w:p>
+        </w:tc>
+        <w:tc>
+          <w:tcPr>
+            <w:tcW w:type="dxa" w:w="4759"/>
+          </w:tcPr>
+          <w:p>
+            <w:r/>
+            <w:r>
+              <w:rPr>
+                <w:rFonts w:ascii="微软雅黑" w:hAnsi="微软雅黑" w:eastAsia="微软雅黑"/>
+                <w:b w:val="0"/>
+                <w:sz w:val="21"/>
+              </w:rPr>
+              <w:t>未完全等价，后续可增强</w:t>
+            </w:r>
+          </w:p>
+        </w:tc>
+      </w:tr>
+      <w:tr>
+        <w:tc>
+          <w:tcPr>
+            <w:tcW w:type="dxa" w:w="4759"/>
+          </w:tcPr>
+          <w:p>
+            <w:r/>
+            <w:r>
+              <w:rPr>
+                <w:rFonts w:ascii="微软雅黑" w:hAnsi="微软雅黑" w:eastAsia="微软雅黑"/>
+                <w:b w:val="0"/>
+                <w:sz w:val="21"/>
+              </w:rPr>
+              <w:t>保证游戏安全 / 不封号</w:t>
+            </w:r>
+          </w:p>
+        </w:tc>
+        <w:tc>
+          <w:tcPr>
+            <w:tcW w:type="dxa" w:w="4759"/>
+          </w:tcPr>
+          <w:p>
+            <w:r/>
+            <w:r>
+              <w:rPr>
+                <w:rFonts w:ascii="微软雅黑" w:hAnsi="微软雅黑" w:eastAsia="微软雅黑"/>
+                <w:b w:val="0"/>
+                <w:sz w:val="21"/>
+              </w:rPr>
+              <w:t>无法保证；请自担风险</w:t>
+            </w:r>
+          </w:p>
+        </w:tc>
+      </w:tr>
     </w:tbl>
     <w:p/>
     <w:p>
@@ -2848,63 +2266,20 @@
           <w:b/>
           <w:sz w:val="32"/>
         </w:rPr>
-        <w:t>九、发给朋友时怎么发</w:t>
+        <w:t>八、常见问题</w:t>
       </w:r>
     </w:p>
     <w:p>
       <w:pPr>
-        <w:pStyle w:val="ListNumber"/>
-        <w:spacing w:after="40"/>
+        <w:spacing w:after="120" w:line="360" w:lineRule="auto"/>
       </w:pPr>
       <w:r>
         <w:rPr>
           <w:rFonts w:ascii="微软雅黑" w:hAnsi="微软雅黑" w:eastAsia="微软雅黑"/>
-          <w:b w:val="0"/>
+          <w:b/>
           <w:sz w:val="22"/>
         </w:rPr>
-        <w:t>发送整个 CleanClient 文件夹（可打成 zip）。</w:t>
-      </w:r>
-    </w:p>
-    <w:p>
-      <w:pPr>
-        <w:pStyle w:val="ListNumber"/>
-        <w:spacing w:after="40"/>
-      </w:pPr>
-      <w:r>
-        <w:rPr>
-          <w:rFonts w:ascii="微软雅黑" w:hAnsi="微软雅黑" w:eastAsia="微软雅黑"/>
-          <w:b w:val="0"/>
-          <w:sz w:val="22"/>
-        </w:rPr>
-        <w:t>让朋友先看「请先读-安装说明.txt」和本手册。</w:t>
-      </w:r>
-    </w:p>
-    <w:p>
-      <w:pPr>
-        <w:pStyle w:val="ListNumber"/>
-        <w:spacing w:after="40"/>
-      </w:pPr>
-      <w:r>
-        <w:rPr>
-          <w:rFonts w:ascii="微软雅黑" w:hAnsi="微软雅黑" w:eastAsia="微软雅黑"/>
-          <w:b w:val="0"/>
-          <w:sz w:val="22"/>
-        </w:rPr>
-        <w:t>朋友必须先把 addon\AutoPlayer 复制到自己的魔兽 AddOns。</w:t>
-      </w:r>
-    </w:p>
-    <w:p>
-      <w:pPr>
-        <w:pStyle w:val="ListNumber"/>
-        <w:spacing w:after="40"/>
-      </w:pPr>
-      <w:r>
-        <w:rPr>
-          <w:rFonts w:ascii="微软雅黑" w:hAnsi="微软雅黑" w:eastAsia="微软雅黑"/>
-          <w:b w:val="0"/>
-          <w:sz w:val="22"/>
-        </w:rPr>
-        <w:t>再运行 CleanClient.exe。</w:t>
+        <w:t>Q：这是最终版吗？</w:t>
       </w:r>
     </w:p>
     <w:p>
@@ -2917,7 +2292,163 @@
           <w:b w:val="0"/>
           <w:sz w:val="22"/>
         </w:rPr>
-        <w:t>如果仓库是 GitHub 私有库：朋友需要你把其加成协作者后，才能下载 Releases。</w:t>
+        <w:t>A：是当前稳定可用发版，不是永远不再改的最终商业版。阶段1–3已完成，后续还可增强。</w:t>
+      </w:r>
+    </w:p>
+    <w:p>
+      <w:pPr>
+        <w:spacing w:after="120" w:line="360" w:lineRule="auto"/>
+      </w:pPr>
+      <w:r>
+        <w:rPr>
+          <w:rFonts w:ascii="微软雅黑" w:hAnsi="微软雅黑" w:eastAsia="微软雅黑"/>
+          <w:b/>
+          <w:sz w:val="22"/>
+        </w:rPr>
+        <w:t>Q：日志一直空闲？</w:t>
+      </w:r>
+    </w:p>
+    <w:p>
+      <w:pPr>
+        <w:spacing w:after="120" w:line="360" w:lineRule="auto"/>
+      </w:pPr>
+      <w:r>
+        <w:rPr>
+          <w:rFonts w:ascii="微软雅黑" w:hAnsi="微软雅黑" w:eastAsia="微软雅黑"/>
+          <w:b w:val="0"/>
+          <w:sz w:val="22"/>
+        </w:rPr>
+        <w:t>A：若仍是模拟识别，正常。像素协议下请检查：插件启用、截屏方式、Skill 框是否对准、预览是否有色块。</w:t>
+      </w:r>
+    </w:p>
+    <w:p>
+      <w:pPr>
+        <w:spacing w:after="120" w:line="360" w:lineRule="auto"/>
+      </w:pPr>
+      <w:r>
+        <w:rPr>
+          <w:rFonts w:ascii="微软雅黑" w:hAnsi="微软雅黑" w:eastAsia="微软雅黑"/>
+          <w:b/>
+          <w:sz w:val="22"/>
+        </w:rPr>
+        <w:t>Q：提示无法启动？</w:t>
+      </w:r>
+    </w:p>
+    <w:p>
+      <w:pPr>
+        <w:spacing w:after="120" w:line="360" w:lineRule="auto"/>
+      </w:pPr>
+      <w:r>
+        <w:rPr>
+          <w:rFonts w:ascii="微软雅黑" w:hAnsi="微软雅黑" w:eastAsia="微软雅黑"/>
+          <w:b w:val="0"/>
+          <w:sz w:val="22"/>
+        </w:rPr>
+        <w:t>A：像素协议必须：真实截屏方式 + 有效 Skill 区域；方式一还要找到魔兽窗口。</w:t>
+      </w:r>
+    </w:p>
+    <w:p>
+      <w:pPr>
+        <w:spacing w:after="120" w:line="360" w:lineRule="auto"/>
+      </w:pPr>
+      <w:r>
+        <w:rPr>
+          <w:rFonts w:ascii="微软雅黑" w:hAnsi="微软雅黑" w:eastAsia="微软雅黑"/>
+          <w:b/>
+          <w:sz w:val="22"/>
+        </w:rPr>
+        <w:t>Q：会不会乱按键？</w:t>
+      </w:r>
+    </w:p>
+    <w:p>
+      <w:pPr>
+        <w:spacing w:after="120" w:line="360" w:lineRule="auto"/>
+      </w:pPr>
+      <w:r>
+        <w:rPr>
+          <w:rFonts w:ascii="微软雅黑" w:hAnsi="微软雅黑" w:eastAsia="微软雅黑"/>
+          <w:b w:val="0"/>
+          <w:sz w:val="22"/>
+        </w:rPr>
+        <w:t>A：默认不会。取消只记日志必须确认；建议先干跑看「按键=」是否正确。</w:t>
+      </w:r>
+    </w:p>
+    <w:p>
+      <w:pPr>
+        <w:spacing w:after="120" w:line="360" w:lineRule="auto"/>
+      </w:pPr>
+      <w:r>
+        <w:rPr>
+          <w:rFonts w:ascii="微软雅黑" w:hAnsi="微软雅黑" w:eastAsia="微软雅黑"/>
+          <w:b/>
+          <w:sz w:val="22"/>
+        </w:rPr>
+        <w:t>Q：自动建议的框不准？</w:t>
+      </w:r>
+    </w:p>
+    <w:p>
+      <w:pPr>
+        <w:spacing w:after="120" w:line="360" w:lineRule="auto"/>
+      </w:pPr>
+      <w:r>
+        <w:rPr>
+          <w:rFonts w:ascii="微软雅黑" w:hAnsi="微软雅黑" w:eastAsia="微软雅黑"/>
+          <w:b w:val="0"/>
+          <w:sz w:val="22"/>
+        </w:rPr>
+        <w:t>A：它是粗定位。请用预览检查，再用标定器精修。</w:t>
+      </w:r>
+    </w:p>
+    <w:p>
+      <w:pPr>
+        <w:spacing w:after="120" w:line="360" w:lineRule="auto"/>
+      </w:pPr>
+      <w:r>
+        <w:rPr>
+          <w:rFonts w:ascii="微软雅黑" w:hAnsi="微软雅黑" w:eastAsia="微软雅黑"/>
+          <w:b/>
+          <w:sz w:val="22"/>
+        </w:rPr>
+        <w:t>Q：朋友怎么用？</w:t>
+      </w:r>
+    </w:p>
+    <w:p>
+      <w:pPr>
+        <w:spacing w:after="120" w:line="360" w:lineRule="auto"/>
+      </w:pPr>
+      <w:r>
+        <w:rPr>
+          <w:rFonts w:ascii="微软雅黑" w:hAnsi="微软雅黑" w:eastAsia="微软雅黑"/>
+          <w:b w:val="0"/>
+          <w:sz w:val="22"/>
+        </w:rPr>
+        <w:t>A：发整个 CleanClient 文件夹；朋友先装插件，再开软件。私有 GitHub 需加协作者才能下 Releases。</w:t>
+      </w:r>
+    </w:p>
+    <w:p>
+      <w:pPr>
+        <w:spacing w:after="120" w:line="360" w:lineRule="auto"/>
+      </w:pPr>
+      <w:r>
+        <w:rPr>
+          <w:rFonts w:ascii="微软雅黑" w:hAnsi="微软雅黑" w:eastAsia="微软雅黑"/>
+          <w:b/>
+          <w:sz w:val="22"/>
+        </w:rPr>
+        <w:t>Q：打包脚本双击没反应？</w:t>
+      </w:r>
+    </w:p>
+    <w:p>
+      <w:pPr>
+        <w:spacing w:after="120" w:line="360" w:lineRule="auto"/>
+      </w:pPr>
+      <w:r>
+        <w:rPr>
+          <w:rFonts w:ascii="微软雅黑" w:hAnsi="微软雅黑" w:eastAsia="微软雅黑"/>
+          <w:b w:val="0"/>
+          <w:sz w:val="22"/>
+        </w:rPr>
+        <w:t>A：请用 scripts\pack-CleanClient.bat；正常会有黑窗口跑约 1.5–2 分钟。</w:t>
       </w:r>
     </w:p>
     <w:p>
@@ -2930,202 +2461,7 @@
           <w:b/>
           <w:sz w:val="32"/>
         </w:rPr>
-        <w:t>十、常见问题</w:t>
-      </w:r>
-    </w:p>
-    <w:p>
-      <w:pPr>
-        <w:spacing w:after="120" w:line="360" w:lineRule="auto"/>
-      </w:pPr>
-      <w:r>
-        <w:rPr>
-          <w:rFonts w:ascii="微软雅黑" w:hAnsi="微软雅黑" w:eastAsia="微软雅黑"/>
-          <w:b/>
-          <w:sz w:val="22"/>
-        </w:rPr>
-        <w:t>Q1：为什么打包目录里一开始找不到 AutoPlayer？</w:t>
-      </w:r>
-    </w:p>
-    <w:p>
-      <w:pPr>
-        <w:spacing w:after="120" w:line="360" w:lineRule="auto"/>
-      </w:pPr>
-      <w:r>
-        <w:rPr>
-          <w:rFonts w:ascii="微软雅黑" w:hAnsi="微软雅黑" w:eastAsia="微软雅黑"/>
-          <w:b w:val="0"/>
-          <w:sz w:val="22"/>
-        </w:rPr>
-        <w:t>A：旧版打包可能只打了 exe。现在新打包会把 addon\AutoPlayer、说明文档一起放进 release\CleanClient。若你手里的包没有，请重新运行 scripts\pack-CleanClient.bat。</w:t>
-      </w:r>
-    </w:p>
-    <w:p>
-      <w:pPr>
-        <w:spacing w:after="120" w:line="360" w:lineRule="auto"/>
-      </w:pPr>
-      <w:r>
-        <w:rPr>
-          <w:rFonts w:ascii="微软雅黑" w:hAnsi="微软雅黑" w:eastAsia="微软雅黑"/>
-          <w:b/>
-          <w:sz w:val="22"/>
-        </w:rPr>
-        <w:t>Q2：双击打包脚本没反应？</w:t>
-      </w:r>
-    </w:p>
-    <w:p>
-      <w:pPr>
-        <w:spacing w:after="120" w:line="360" w:lineRule="auto"/>
-      </w:pPr>
-      <w:r>
-        <w:rPr>
-          <w:rFonts w:ascii="微软雅黑" w:hAnsi="微软雅黑" w:eastAsia="微软雅黑"/>
-          <w:b w:val="0"/>
-          <w:sz w:val="22"/>
-        </w:rPr>
-        <w:t>A：请改双击 scripts\pack-CleanClient.bat。正常会弹出黑窗口运行约 1.5～2 分钟。若秒退，把窗口里的报错发出来。</w:t>
-      </w:r>
-    </w:p>
-    <w:p>
-      <w:pPr>
-        <w:spacing w:after="120" w:line="360" w:lineRule="auto"/>
-      </w:pPr>
-      <w:r>
-        <w:rPr>
-          <w:rFonts w:ascii="微软雅黑" w:hAnsi="微软雅黑" w:eastAsia="微软雅黑"/>
-          <w:b/>
-          <w:sz w:val="22"/>
-        </w:rPr>
-        <w:t>Q3：日志一直是「空闲」？</w:t>
-      </w:r>
-    </w:p>
-    <w:p>
-      <w:pPr>
-        <w:spacing w:after="120" w:line="360" w:lineRule="auto"/>
-      </w:pPr>
-      <w:r>
-        <w:rPr>
-          <w:rFonts w:ascii="微软雅黑" w:hAnsi="微软雅黑" w:eastAsia="微软雅黑"/>
-          <w:b w:val="0"/>
-          <w:sz w:val="22"/>
-        </w:rPr>
-        <w:t>A：默认「模拟识别」不读屏，所以一直空闲是正常的。</w:t>
-      </w:r>
-    </w:p>
-    <w:p>
-      <w:pPr>
-        <w:spacing w:after="120" w:line="360" w:lineRule="auto"/>
-      </w:pPr>
-      <w:r>
-        <w:rPr>
-          <w:rFonts w:ascii="微软雅黑" w:hAnsi="微软雅黑" w:eastAsia="微软雅黑"/>
-          <w:b/>
-          <w:sz w:val="22"/>
-        </w:rPr>
-        <w:t>Q4：会不会给我乱按键？</w:t>
-      </w:r>
-    </w:p>
-    <w:p>
-      <w:pPr>
-        <w:spacing w:after="120" w:line="360" w:lineRule="auto"/>
-      </w:pPr>
-      <w:r>
-        <w:rPr>
-          <w:rFonts w:ascii="微软雅黑" w:hAnsi="微软雅黑" w:eastAsia="微软雅黑"/>
-          <w:b w:val="0"/>
-          <w:sz w:val="22"/>
-        </w:rPr>
-        <w:t>A：勾选「只记日志，不按键」时不会。请一直保持勾选，直到你明确知道自己在做什么。</w:t>
-      </w:r>
-    </w:p>
-    <w:p>
-      <w:pPr>
-        <w:spacing w:after="120" w:line="360" w:lineRule="auto"/>
-      </w:pPr>
-      <w:r>
-        <w:rPr>
-          <w:rFonts w:ascii="微软雅黑" w:hAnsi="微软雅黑" w:eastAsia="微软雅黑"/>
-          <w:b/>
-          <w:sz w:val="22"/>
-        </w:rPr>
-        <w:t>Q5：插件复制了但游戏里没有？</w:t>
-      </w:r>
-    </w:p>
-    <w:p>
-      <w:pPr>
-        <w:spacing w:after="120" w:line="360" w:lineRule="auto"/>
-      </w:pPr>
-      <w:r>
-        <w:rPr>
-          <w:rFonts w:ascii="微软雅黑" w:hAnsi="微软雅黑" w:eastAsia="微软雅黑"/>
-          <w:b w:val="0"/>
-          <w:sz w:val="22"/>
-        </w:rPr>
-        <w:t>A：检查是否复制到 _retail_\Interface\AddOns；是否多套一层文件夹；是否在选人界面启用；是否完全重启过游戏。</w:t>
-      </w:r>
-    </w:p>
-    <w:p>
-      <w:pPr>
-        <w:spacing w:after="120" w:line="360" w:lineRule="auto"/>
-      </w:pPr>
-      <w:r>
-        <w:rPr>
-          <w:rFonts w:ascii="微软雅黑" w:hAnsi="微软雅黑" w:eastAsia="微软雅黑"/>
-          <w:b/>
-          <w:sz w:val="22"/>
-        </w:rPr>
-        <w:t>Q6：杀毒软件报毒？</w:t>
-      </w:r>
-    </w:p>
-    <w:p>
-      <w:pPr>
-        <w:spacing w:after="120" w:line="360" w:lineRule="auto"/>
-      </w:pPr>
-      <w:r>
-        <w:rPr>
-          <w:rFonts w:ascii="微软雅黑" w:hAnsi="微软雅黑" w:eastAsia="微软雅黑"/>
-          <w:b w:val="0"/>
-          <w:sz w:val="22"/>
-        </w:rPr>
-        <w:t>A：本地 PyInstaller 打包程序常见误报。请先确认文件来源是你自己的项目打包结果，再加入信任区。</w:t>
-      </w:r>
-    </w:p>
-    <w:p>
-      <w:pPr>
-        <w:spacing w:after="120" w:line="360" w:lineRule="auto"/>
-      </w:pPr>
-      <w:r>
-        <w:rPr>
-          <w:rFonts w:ascii="微软雅黑" w:hAnsi="微软雅黑" w:eastAsia="微软雅黑"/>
-          <w:b/>
-          <w:sz w:val="22"/>
-        </w:rPr>
-        <w:t>Q7：我想要真正自动循环，下一步要做什么？</w:t>
-      </w:r>
-    </w:p>
-    <w:p>
-      <w:pPr>
-        <w:spacing w:after="120" w:line="360" w:lineRule="auto"/>
-      </w:pPr>
-      <w:r>
-        <w:rPr>
-          <w:rFonts w:ascii="微软雅黑" w:hAnsi="微软雅黑" w:eastAsia="微软雅黑"/>
-          <w:b w:val="0"/>
-          <w:sz w:val="22"/>
-        </w:rPr>
-        <w:t>A：1）装好并启用 AutoPlayer；2）用真实截屏标定 Skill 等区域；3）把识别模式改到像素协议；4）确认日志里能看到真实动作后，再考虑取消「只记日志」。当前版本尚未把这条链路完全打通。</w:t>
-      </w:r>
-    </w:p>
-    <w:p>
-      <w:pPr>
-        <w:pStyle w:val="Heading1"/>
-      </w:pPr>
-      <w:r>
-        <w:rPr>
-          <w:rFonts w:ascii="微软雅黑" w:hAnsi="微软雅黑" w:eastAsia="微软雅黑"/>
-          <w:b/>
-          <w:sz w:val="32"/>
-        </w:rPr>
-        <w:t>十一、推荐操作清单（打勾用）</w:t>
+        <w:t>九、验收清单</w:t>
       </w:r>
     </w:p>
     <w:p>
@@ -3139,7 +2475,7 @@
           <w:b w:val="0"/>
           <w:sz w:val="22"/>
         </w:rPr>
-        <w:t>已拿到完整 CleanClient 文件夹</w:t>
+        <w:t>已复制 AutoPlayer 到 _retail_\Interface\AddOns 并勾选</w:t>
       </w:r>
     </w:p>
     <w:p>
@@ -3153,7 +2489,7 @@
           <w:b w:val="0"/>
           <w:sz w:val="22"/>
         </w:rPr>
-        <w:t>已把 addon\AutoPlayer 复制到 _retail_\Interface\AddOns\AutoPlayer</w:t>
+        <w:t>已打开完整 CleanClient 文件夹中的 exe</w:t>
       </w:r>
     </w:p>
     <w:p>
@@ -3167,7 +2503,7 @@
           <w:b w:val="0"/>
           <w:sz w:val="22"/>
         </w:rPr>
-        <w:t>游戏选人界面已勾选 AutoPlayer</w:t>
+        <w:t>只记日志已勾选</w:t>
       </w:r>
     </w:p>
     <w:p>
@@ -3181,7 +2517,7 @@
           <w:b w:val="0"/>
           <w:sz w:val="22"/>
         </w:rPr>
-        <w:t>已双击 CleanClient.exe 打开软件</w:t>
+        <w:t>识别=像素协议，截屏=方式一/二/三</w:t>
       </w:r>
     </w:p>
     <w:p>
@@ -3195,7 +2531,7 @@
           <w:b w:val="0"/>
           <w:sz w:val="22"/>
         </w:rPr>
-        <w:t>控制台已勾选「只记日志，不按键」</w:t>
+        <w:t>已自动建议或手动标定 Skill，预览框大致正确</w:t>
       </w:r>
     </w:p>
     <w:p>
@@ -3209,7 +2545,7 @@
           <w:b w:val="0"/>
           <w:sz w:val="22"/>
         </w:rPr>
-        <w:t>截屏方式先选「空（测试）」并成功启动 / 停止</w:t>
+        <w:t>启动后日志出现动作 法术ID=…，按键= 符合键位</w:t>
       </w:r>
     </w:p>
     <w:p>
@@ -3223,21 +2559,7 @@
           <w:b w:val="0"/>
           <w:sz w:val="22"/>
         </w:rPr>
-        <w:t>日志能看到「空闲」或其他输出</w:t>
-      </w:r>
-    </w:p>
-    <w:p>
-      <w:pPr>
-        <w:pStyle w:val="ListBullet"/>
-        <w:spacing w:after="40"/>
-      </w:pPr>
-      <w:r>
-        <w:rPr>
-          <w:rFonts w:ascii="微软雅黑" w:hAnsi="微软雅黑" w:eastAsia="微软雅黑"/>
-          <w:b w:val="0"/>
-          <w:sz w:val="22"/>
-        </w:rPr>
-        <w:t>（可选）已打开标定器练习框选并保存</w:t>
+        <w:t>（可选）确认后才关闭只记日志尝试真按键</w:t>
       </w:r>
     </w:p>
     <w:p>
@@ -3250,7 +2572,7 @@
           <w:b/>
           <w:sz w:val="32"/>
         </w:rPr>
-        <w:t>十二、相关文件位置</w:t>
+        <w:t>十、相关路径</w:t>
       </w:r>
     </w:p>
     <w:tbl>
@@ -3378,40 +2700,6 @@
                 <w:b w:val="0"/>
                 <w:sz w:val="21"/>
               </w:rPr>
-              <w:t>简版安装说明</w:t>
-            </w:r>
-          </w:p>
-        </w:tc>
-        <w:tc>
-          <w:tcPr>
-            <w:tcW w:type="dxa" w:w="4759"/>
-          </w:tcPr>
-          <w:p>
-            <w:r/>
-            <w:r>
-              <w:rPr>
-                <w:rFonts w:ascii="微软雅黑" w:hAnsi="微软雅黑" w:eastAsia="微软雅黑"/>
-                <w:b w:val="0"/>
-                <w:sz w:val="21"/>
-              </w:rPr>
-              <w:t>release\CleanClient\请先读-安装说明.txt</w:t>
-            </w:r>
-          </w:p>
-        </w:tc>
-      </w:tr>
-      <w:tr>
-        <w:tc>
-          <w:tcPr>
-            <w:tcW w:type="dxa" w:w="4759"/>
-          </w:tcPr>
-          <w:p>
-            <w:r/>
-            <w:r>
-              <w:rPr>
-                <w:rFonts w:ascii="微软雅黑" w:hAnsi="微软雅黑" w:eastAsia="微软雅黑"/>
-                <w:b w:val="0"/>
-                <w:sz w:val="21"/>
-              </w:rPr>
               <w:t>Markdown 手册</w:t>
             </w:r>
           </w:p>
@@ -3480,7 +2768,7 @@
                 <w:b w:val="0"/>
                 <w:sz w:val="21"/>
               </w:rPr>
-              <w:t>插件源目录</w:t>
+              <w:t>插件源</w:t>
             </w:r>
           </w:p>
         </w:tc>
@@ -3513,7 +2801,7 @@
           <w:b/>
           <w:sz w:val="22"/>
         </w:rPr>
-        <w:t>—— 文档结束 —— 若某一步和你屏幕上不一致，把截图发出来即可对照修改。</w:t>
+        <w:t>—— 文档结束 —— 若某一步与屏幕不符，把截图发出来即可对照修改。</w:t>
       </w:r>
     </w:p>
     <w:sectPr>

</xml_diff>